<commit_message>
Preparato l'Excel per il Quality Appraisal
</commit_message>
<xml_diff>
--- a/6_Quality_Appraisal/Quality_Appraisal_DARE_Questions.docx
+++ b/6_Quality_Appraisal/Quality_Appraisal_DARE_Questions.docx
@@ -1,6 +1,6 @@
 
 <file path=word/document.xml><?xml version="1.0" encoding="utf-8"?>
-<w:document xmlns:wpc="http://schemas.microsoft.com/office/word/2010/wordprocessingCanvas" xmlns:cx="http://schemas.microsoft.com/office/drawing/2014/chartex" xmlns:cx1="http://schemas.microsoft.com/office/drawing/2015/9/8/chartex" xmlns:cx2="http://schemas.microsoft.com/office/drawing/2015/10/21/chartex" xmlns:cx3="http://schemas.microsoft.com/office/drawing/2016/5/9/chartex" xmlns:cx4="http://schemas.microsoft.com/office/drawing/2016/5/10/chartex" xmlns:cx5="http://schemas.microsoft.com/office/drawing/2016/5/11/chartex" xmlns:cx6="http://schemas.microsoft.com/office/drawing/2016/5/12/chartex" xmlns:cx7="http://schemas.microsoft.com/office/drawing/2016/5/13/chartex" xmlns:cx8="http://schemas.microsoft.com/office/drawing/2016/5/14/chartex" xmlns:mc="http://schemas.openxmlformats.org/markup-compatibility/2006" xmlns:aink="http://schemas.microsoft.com/office/drawing/2016/ink" xmlns:am3d="http://schemas.microsoft.com/office/drawing/2017/model3d" xmlns:o="urn:schemas-microsoft-com:office:office" xmlns:oel="http://schemas.microsoft.com/office/2019/extlst" xmlns:r="http://schemas.openxmlformats.org/officeDocument/2006/relationships" xmlns:m="http://schemas.openxmlformats.org/officeDocument/2006/math" xmlns:v="urn:schemas-microsoft-com:vml" xmlns:wp14="http://schemas.microsoft.com/office/word/2010/wordprocessingDrawing" xmlns:wp="http://schemas.openxmlformats.org/drawingml/2006/wordprocessingDrawing" xmlns:w10="urn:schemas-microsoft-com:office:word" xmlns:w="http://schemas.openxmlformats.org/wordprocessingml/2006/main" xmlns:w14="http://schemas.microsoft.com/office/word/2010/wordml" xmlns:w15="http://schemas.microsoft.com/office/word/2012/wordml" xmlns:w16cex="http://schemas.microsoft.com/office/word/2018/wordml/cex" xmlns:w16cid="http://schemas.microsoft.com/office/word/2016/wordml/cid" xmlns:w16="http://schemas.microsoft.com/office/word/2018/wordml" xmlns:w16du="http://schemas.microsoft.com/office/word/2023/wordml/word16du" xmlns:w16sdtdh="http://schemas.microsoft.com/office/word/2020/wordml/sdtdatahash" xmlns:w16sdtfl="http://schemas.microsoft.com/office/word/2024/wordml/sdtformatlock" xmlns:w16se="http://schemas.microsoft.com/office/word/2015/wordml/symex" xmlns:wpg="http://schemas.microsoft.com/office/word/2010/wordprocessingGroup" xmlns:wpi="http://schemas.microsoft.com/office/word/2010/wordprocessingInk" xmlns:wne="http://schemas.microsoft.com/office/word/2006/wordml" xmlns:wps="http://schemas.microsoft.com/office/word/2010/wordprocessingShape" mc:Ignorable="w14 w15 w16se w16cid w16 w16cex w16sdtdh w16sdtfl w16du wp14">
+<w:document xmlns:wpc="http://schemas.microsoft.com/office/word/2010/wordprocessingCanvas" xmlns:cx="http://schemas.microsoft.com/office/drawing/2014/chartex" xmlns:cx1="http://schemas.microsoft.com/office/drawing/2015/9/8/chartex" xmlns:cx2="http://schemas.microsoft.com/office/drawing/2015/10/21/chartex" xmlns:cx3="http://schemas.microsoft.com/office/drawing/2016/5/9/chartex" xmlns:cx4="http://schemas.microsoft.com/office/drawing/2016/5/10/chartex" xmlns:cx5="http://schemas.microsoft.com/office/drawing/2016/5/11/chartex" xmlns:cx6="http://schemas.microsoft.com/office/drawing/2016/5/12/chartex" xmlns:cx7="http://schemas.microsoft.com/office/drawing/2016/5/13/chartex" xmlns:cx8="http://schemas.microsoft.com/office/drawing/2016/5/14/chartex" xmlns:mc="http://schemas.openxmlformats.org/markup-compatibility/2006" xmlns:m="http://schemas.openxmlformats.org/officeDocument/2006/math" xmlns:aink="http://schemas.microsoft.com/office/drawing/2016/ink" xmlns:am3d="http://schemas.microsoft.com/office/drawing/2017/model3d" xmlns:oel="http://schemas.microsoft.com/office/2019/extlst" xmlns:r="http://schemas.openxmlformats.org/officeDocument/2006/relationships" xmlns:wp14="http://schemas.microsoft.com/office/word/2010/wordprocessingDrawing" xmlns:wp="http://schemas.openxmlformats.org/drawingml/2006/wordprocessingDrawing" xmlns:wpg="http://schemas.microsoft.com/office/word/2010/wordprocessingGroup" xmlns:wpi="http://schemas.microsoft.com/office/word/2010/wordprocessingInk" xmlns:wps="http://schemas.microsoft.com/office/word/2010/wordprocessingShape" xmlns:o="urn:schemas-microsoft-com:office:office" xmlns:v="urn:schemas-microsoft-com:vml" xmlns:w10="urn:schemas-microsoft-com:office:word" xmlns:w="http://schemas.openxmlformats.org/wordprocessingml/2006/main" xmlns:w14="http://schemas.microsoft.com/office/word/2010/wordml" xmlns:w15="http://schemas.microsoft.com/office/word/2012/wordml" xmlns:w16cei="http://schemas.microsoft.com/office/word/2026/wordml/cei" xmlns:w16cex="http://schemas.microsoft.com/office/word/2018/wordml/cex" xmlns:w16cid="http://schemas.microsoft.com/office/word/2016/wordml/cid" xmlns:w16="http://schemas.microsoft.com/office/word/2018/wordml" xmlns:w16sdtdh="http://schemas.microsoft.com/office/word/2020/wordml/sdtdatahash" xmlns:w16sdtfl="http://schemas.microsoft.com/office/word/2024/wordml/sdtformatlock" xmlns:w16se="http://schemas.microsoft.com/office/word/2015/wordml/symex" xmlns:w16du="http://schemas.microsoft.com/office/word/2023/wordml/word16du" xmlns:wne="http://schemas.microsoft.com/office/word/2006/wordml" mc:Ignorable="w14 w15 w16se w16cid w16 w16cex w16sdtdh w16sdtfl w16du wp14">
   <w:body>
     <w:p>
       <w:pPr>
@@ -565,7 +565,21 @@
         <w:rPr>
           <w:lang w:val="it-IT"/>
         </w:rPr>
-        <w:t>: more than 12</w:t>
+        <w:t xml:space="preserve">: more </w:t>
+      </w:r>
+      <w:proofErr w:type="spellStart"/>
+      <w:r>
+        <w:rPr>
+          <w:lang w:val="it-IT"/>
+        </w:rPr>
+        <w:t>than</w:t>
+      </w:r>
+      <w:proofErr w:type="spellEnd"/>
+      <w:r>
+        <w:rPr>
+          <w:lang w:val="it-IT"/>
+        </w:rPr>
+        <w:t xml:space="preserve"> 12</w:t>
       </w:r>
     </w:p>
     <w:p>
@@ -621,7 +635,35 @@
         <w:rPr>
           <w:lang w:val="it-IT"/>
         </w:rPr>
-        <w:t>: less than 4</w:t>
+        <w:t xml:space="preserve">: </w:t>
+      </w:r>
+      <w:proofErr w:type="spellStart"/>
+      <w:r>
+        <w:rPr>
+          <w:lang w:val="it-IT"/>
+        </w:rPr>
+        <w:t>less</w:t>
+      </w:r>
+      <w:proofErr w:type="spellEnd"/>
+      <w:r>
+        <w:rPr>
+          <w:lang w:val="it-IT"/>
+        </w:rPr>
+        <w:t xml:space="preserve"> </w:t>
+      </w:r>
+      <w:proofErr w:type="spellStart"/>
+      <w:r>
+        <w:rPr>
+          <w:lang w:val="it-IT"/>
+        </w:rPr>
+        <w:t>than</w:t>
+      </w:r>
+      <w:proofErr w:type="spellEnd"/>
+      <w:r>
+        <w:rPr>
+          <w:lang w:val="it-IT"/>
+        </w:rPr>
+        <w:t xml:space="preserve"> 4</w:t>
       </w:r>
     </w:p>
     <w:p>
@@ -755,7 +797,49 @@
         <w:rPr>
           <w:lang w:val="it-IT"/>
         </w:rPr>
-        <w:t>: Only superficial description.</w:t>
+        <w:t xml:space="preserve">: </w:t>
+      </w:r>
+      <w:proofErr w:type="spellStart"/>
+      <w:r>
+        <w:rPr>
+          <w:lang w:val="it-IT"/>
+        </w:rPr>
+        <w:t>Only</w:t>
+      </w:r>
+      <w:proofErr w:type="spellEnd"/>
+      <w:r>
+        <w:rPr>
+          <w:lang w:val="it-IT"/>
+        </w:rPr>
+        <w:t xml:space="preserve"> </w:t>
+      </w:r>
+      <w:proofErr w:type="spellStart"/>
+      <w:r>
+        <w:rPr>
+          <w:lang w:val="it-IT"/>
+        </w:rPr>
+        <w:t>superficial</w:t>
+      </w:r>
+      <w:proofErr w:type="spellEnd"/>
+      <w:r>
+        <w:rPr>
+          <w:lang w:val="it-IT"/>
+        </w:rPr>
+        <w:t xml:space="preserve"> </w:t>
+      </w:r>
+      <w:proofErr w:type="spellStart"/>
+      <w:r>
+        <w:rPr>
+          <w:lang w:val="it-IT"/>
+        </w:rPr>
+        <w:t>description</w:t>
+      </w:r>
+      <w:proofErr w:type="spellEnd"/>
+      <w:r>
+        <w:rPr>
+          <w:lang w:val="it-IT"/>
+        </w:rPr>
+        <w:t>.</w:t>
       </w:r>
     </w:p>
     <w:p>
@@ -811,7 +895,10 @@
         <w:t>1.0</w:t>
       </w:r>
       <w:r>
-        <w:t>: 2023/2025</w:t>
+        <w:t>: 2023/202</w:t>
+      </w:r>
+      <w:r>
+        <w:t>6</w:t>
       </w:r>
     </w:p>
     <w:p>
@@ -962,7 +1049,21 @@
         <w:rPr>
           <w:lang w:val="en-US"/>
         </w:rPr>
-        <w:t>: referenced in selected SLR or Survey, or cited more than 12 times according to Google Scholar.</w:t>
+        <w:t xml:space="preserve">: referenced in selected SLR or </w:t>
+      </w:r>
+      <w:proofErr w:type="gramStart"/>
+      <w:r>
+        <w:rPr>
+          <w:lang w:val="en-US"/>
+        </w:rPr>
+        <w:t>Survey, or</w:t>
+      </w:r>
+      <w:proofErr w:type="gramEnd"/>
+      <w:r>
+        <w:rPr>
+          <w:lang w:val="en-US"/>
+        </w:rPr>
+        <w:t xml:space="preserve"> cited more than 12 times according to Google Scholar.</w:t>
       </w:r>
     </w:p>
     <w:p>
@@ -987,8 +1088,16 @@
         <w:rPr>
           <w:lang w:val="it-IT"/>
         </w:rPr>
-        <w:t>: 8 to 12 citations</w:t>
-      </w:r>
+        <w:t xml:space="preserve">: 8 to 12 </w:t>
+      </w:r>
+      <w:proofErr w:type="spellStart"/>
+      <w:r>
+        <w:rPr>
+          <w:lang w:val="it-IT"/>
+        </w:rPr>
+        <w:t>citations</w:t>
+      </w:r>
+      <w:proofErr w:type="spellEnd"/>
     </w:p>
     <w:p>
       <w:pPr>
@@ -1012,8 +1121,16 @@
         <w:rPr>
           <w:lang w:val="it-IT"/>
         </w:rPr>
-        <w:t>: 4 to 7 citations</w:t>
-      </w:r>
+        <w:t xml:space="preserve">: 4 to 7 </w:t>
+      </w:r>
+      <w:proofErr w:type="spellStart"/>
+      <w:r>
+        <w:rPr>
+          <w:lang w:val="it-IT"/>
+        </w:rPr>
+        <w:t>citations</w:t>
+      </w:r>
+      <w:proofErr w:type="spellEnd"/>
     </w:p>
     <w:p>
       <w:pPr>
@@ -1037,8 +1154,44 @@
         <w:rPr>
           <w:lang w:val="it-IT"/>
         </w:rPr>
-        <w:t>: less than 4 citations</w:t>
-      </w:r>
+        <w:t xml:space="preserve">: </w:t>
+      </w:r>
+      <w:proofErr w:type="spellStart"/>
+      <w:r>
+        <w:rPr>
+          <w:lang w:val="it-IT"/>
+        </w:rPr>
+        <w:t>less</w:t>
+      </w:r>
+      <w:proofErr w:type="spellEnd"/>
+      <w:r>
+        <w:rPr>
+          <w:lang w:val="it-IT"/>
+        </w:rPr>
+        <w:t xml:space="preserve"> </w:t>
+      </w:r>
+      <w:proofErr w:type="spellStart"/>
+      <w:r>
+        <w:rPr>
+          <w:lang w:val="it-IT"/>
+        </w:rPr>
+        <w:t>than</w:t>
+      </w:r>
+      <w:proofErr w:type="spellEnd"/>
+      <w:r>
+        <w:rPr>
+          <w:lang w:val="it-IT"/>
+        </w:rPr>
+        <w:t xml:space="preserve"> 4 </w:t>
+      </w:r>
+      <w:proofErr w:type="spellStart"/>
+      <w:r>
+        <w:rPr>
+          <w:lang w:val="it-IT"/>
+        </w:rPr>
+        <w:t>citations</w:t>
+      </w:r>
+      <w:proofErr w:type="spellEnd"/>
     </w:p>
     <w:p/>
     <w:p/>
@@ -1948,7 +2101,7 @@
 </file>
 
 <file path=word/numbering.xml><?xml version="1.0" encoding="utf-8"?>
-<w:numbering xmlns:wpc="http://schemas.microsoft.com/office/word/2010/wordprocessingCanvas" xmlns:cx="http://schemas.microsoft.com/office/drawing/2014/chartex" xmlns:cx1="http://schemas.microsoft.com/office/drawing/2015/9/8/chartex" xmlns:cx2="http://schemas.microsoft.com/office/drawing/2015/10/21/chartex" xmlns:cx3="http://schemas.microsoft.com/office/drawing/2016/5/9/chartex" xmlns:cx4="http://schemas.microsoft.com/office/drawing/2016/5/10/chartex" xmlns:cx5="http://schemas.microsoft.com/office/drawing/2016/5/11/chartex" xmlns:cx6="http://schemas.microsoft.com/office/drawing/2016/5/12/chartex" xmlns:cx7="http://schemas.microsoft.com/office/drawing/2016/5/13/chartex" xmlns:cx8="http://schemas.microsoft.com/office/drawing/2016/5/14/chartex" xmlns:mc="http://schemas.openxmlformats.org/markup-compatibility/2006" xmlns:aink="http://schemas.microsoft.com/office/drawing/2016/ink" xmlns:am3d="http://schemas.microsoft.com/office/drawing/2017/model3d" xmlns:o="urn:schemas-microsoft-com:office:office" xmlns:oel="http://schemas.microsoft.com/office/2019/extlst" xmlns:r="http://schemas.openxmlformats.org/officeDocument/2006/relationships" xmlns:m="http://schemas.openxmlformats.org/officeDocument/2006/math" xmlns:v="urn:schemas-microsoft-com:vml" xmlns:wp14="http://schemas.microsoft.com/office/word/2010/wordprocessingDrawing" xmlns:wp="http://schemas.openxmlformats.org/drawingml/2006/wordprocessingDrawing" xmlns:w10="urn:schemas-microsoft-com:office:word" xmlns:w="http://schemas.openxmlformats.org/wordprocessingml/2006/main" xmlns:w14="http://schemas.microsoft.com/office/word/2010/wordml" xmlns:w15="http://schemas.microsoft.com/office/word/2012/wordml" xmlns:w16cex="http://schemas.microsoft.com/office/word/2018/wordml/cex" xmlns:w16cid="http://schemas.microsoft.com/office/word/2016/wordml/cid" xmlns:w16="http://schemas.microsoft.com/office/word/2018/wordml" xmlns:w16du="http://schemas.microsoft.com/office/word/2023/wordml/word16du" xmlns:w16sdtdh="http://schemas.microsoft.com/office/word/2020/wordml/sdtdatahash" xmlns:w16sdtfl="http://schemas.microsoft.com/office/word/2024/wordml/sdtformatlock" xmlns:w16se="http://schemas.microsoft.com/office/word/2015/wordml/symex" xmlns:wpg="http://schemas.microsoft.com/office/word/2010/wordprocessingGroup" xmlns:wpi="http://schemas.microsoft.com/office/word/2010/wordprocessingInk" xmlns:wne="http://schemas.microsoft.com/office/word/2006/wordml" xmlns:wps="http://schemas.microsoft.com/office/word/2010/wordprocessingShape" mc:Ignorable="w14 w15 w16se w16cid w16 w16cex w16sdtdh w16sdtfl w16du wp14">
+<w:numbering xmlns:wpc="http://schemas.microsoft.com/office/word/2010/wordprocessingCanvas" xmlns:cx="http://schemas.microsoft.com/office/drawing/2014/chartex" xmlns:cx1="http://schemas.microsoft.com/office/drawing/2015/9/8/chartex" xmlns:cx2="http://schemas.microsoft.com/office/drawing/2015/10/21/chartex" xmlns:cx3="http://schemas.microsoft.com/office/drawing/2016/5/9/chartex" xmlns:cx4="http://schemas.microsoft.com/office/drawing/2016/5/10/chartex" xmlns:cx5="http://schemas.microsoft.com/office/drawing/2016/5/11/chartex" xmlns:cx6="http://schemas.microsoft.com/office/drawing/2016/5/12/chartex" xmlns:cx7="http://schemas.microsoft.com/office/drawing/2016/5/13/chartex" xmlns:cx8="http://schemas.microsoft.com/office/drawing/2016/5/14/chartex" xmlns:mc="http://schemas.openxmlformats.org/markup-compatibility/2006" xmlns:m="http://schemas.openxmlformats.org/officeDocument/2006/math" xmlns:aink="http://schemas.microsoft.com/office/drawing/2016/ink" xmlns:am3d="http://schemas.microsoft.com/office/drawing/2017/model3d" xmlns:oel="http://schemas.microsoft.com/office/2019/extlst" xmlns:r="http://schemas.openxmlformats.org/officeDocument/2006/relationships" xmlns:wp14="http://schemas.microsoft.com/office/word/2010/wordprocessingDrawing" xmlns:wp="http://schemas.openxmlformats.org/drawingml/2006/wordprocessingDrawing" xmlns:wpg="http://schemas.microsoft.com/office/word/2010/wordprocessingGroup" xmlns:wpi="http://schemas.microsoft.com/office/word/2010/wordprocessingInk" xmlns:wps="http://schemas.microsoft.com/office/word/2010/wordprocessingShape" xmlns:o="urn:schemas-microsoft-com:office:office" xmlns:v="urn:schemas-microsoft-com:vml" xmlns:w10="urn:schemas-microsoft-com:office:word" xmlns:w="http://schemas.openxmlformats.org/wordprocessingml/2006/main" xmlns:w14="http://schemas.microsoft.com/office/word/2010/wordml" xmlns:w15="http://schemas.microsoft.com/office/word/2012/wordml" xmlns:w16cei="http://schemas.microsoft.com/office/word/2026/wordml/cei" xmlns:w16cex="http://schemas.microsoft.com/office/word/2018/wordml/cex" xmlns:w16cid="http://schemas.microsoft.com/office/word/2016/wordml/cid" xmlns:w16="http://schemas.microsoft.com/office/word/2018/wordml" xmlns:w16sdtdh="http://schemas.microsoft.com/office/word/2020/wordml/sdtdatahash" xmlns:w16sdtfl="http://schemas.microsoft.com/office/word/2024/wordml/sdtformatlock" xmlns:w16se="http://schemas.microsoft.com/office/word/2015/wordml/symex" xmlns:w16du="http://schemas.microsoft.com/office/word/2023/wordml/word16du" xmlns:wne="http://schemas.microsoft.com/office/word/2006/wordml" mc:Ignorable="w14 w15 w16se w16cid w16 w16cex w16sdtdh w16sdtfl w16du wp14">
   <w:abstractNum w:abstractNumId="0" w15:restartNumberingAfterBreak="0">
     <w:nsid w:val="01693817"/>
     <w:multiLevelType w:val="multilevel"/>
@@ -3113,7 +3266,7 @@
 </file>
 
 <file path=word/styles.xml><?xml version="1.0" encoding="utf-8"?>
-<w:styles xmlns:mc="http://schemas.openxmlformats.org/markup-compatibility/2006" xmlns:r="http://schemas.openxmlformats.org/officeDocument/2006/relationships" xmlns:w="http://schemas.openxmlformats.org/wordprocessingml/2006/main" xmlns:w14="http://schemas.microsoft.com/office/word/2010/wordml" xmlns:w15="http://schemas.microsoft.com/office/word/2012/wordml" xmlns:w16cex="http://schemas.microsoft.com/office/word/2018/wordml/cex" xmlns:w16cid="http://schemas.microsoft.com/office/word/2016/wordml/cid" xmlns:w16="http://schemas.microsoft.com/office/word/2018/wordml" xmlns:w16du="http://schemas.microsoft.com/office/word/2023/wordml/word16du" xmlns:w16sdtdh="http://schemas.microsoft.com/office/word/2020/wordml/sdtdatahash" xmlns:w16sdtfl="http://schemas.microsoft.com/office/word/2024/wordml/sdtformatlock" xmlns:w16se="http://schemas.microsoft.com/office/word/2015/wordml/symex" mc:Ignorable="w14 w15 w16se w16cid w16 w16cex w16sdtdh w16sdtfl w16du">
+<w:styles xmlns:mc="http://schemas.openxmlformats.org/markup-compatibility/2006" xmlns:r="http://schemas.openxmlformats.org/officeDocument/2006/relationships" xmlns:w="http://schemas.openxmlformats.org/wordprocessingml/2006/main" xmlns:w14="http://schemas.microsoft.com/office/word/2010/wordml" xmlns:w15="http://schemas.microsoft.com/office/word/2012/wordml" xmlns:w16cex="http://schemas.microsoft.com/office/word/2018/wordml/cex" xmlns:w16cid="http://schemas.microsoft.com/office/word/2016/wordml/cid" xmlns:w16="http://schemas.microsoft.com/office/word/2018/wordml" xmlns:w16sdtdh="http://schemas.microsoft.com/office/word/2020/wordml/sdtdatahash" xmlns:w16sdtfl="http://schemas.microsoft.com/office/word/2024/wordml/sdtformatlock" xmlns:w16se="http://schemas.microsoft.com/office/word/2015/wordml/symex" xmlns:w16du="http://schemas.microsoft.com/office/word/2023/wordml/word16du" mc:Ignorable="w14 w15 w16se w16cid w16 w16cex w16sdtdh w16sdtfl w16du">
   <w:docDefaults>
     <w:rPrDefault>
       <w:rPr>
@@ -3509,7 +3662,7 @@
     <w:lsdException w:name="Unresolved Mention" w:semiHidden="1" w:unhideWhenUsed="1"/>
     <w:lsdException w:name="Smart Link" w:semiHidden="1" w:unhideWhenUsed="1"/>
   </w:latentStyles>
-  <w:style w:type="paragraph" w:default="1" w:styleId="Normal">
+  <w:style w:type="paragraph" w:default="1" w:styleId="Normale">
     <w:name w:val="Normal"/>
     <w:qFormat/>
     <w:rsid w:val="00FF403B"/>
@@ -3525,10 +3678,10 @@
       <w14:ligatures w14:val="none"/>
     </w:rPr>
   </w:style>
-  <w:style w:type="paragraph" w:styleId="Heading1">
+  <w:style w:type="paragraph" w:styleId="Titolo1">
     <w:name w:val="heading 1"/>
-    <w:basedOn w:val="Normal"/>
-    <w:next w:val="Normal"/>
+    <w:basedOn w:val="Normale"/>
+    <w:next w:val="Normale"/>
     <w:uiPriority w:val="9"/>
     <w:qFormat/>
     <w:rsid w:val="00FF403B"/>
@@ -3545,10 +3698,10 @@
       <w:szCs w:val="40"/>
     </w:rPr>
   </w:style>
-  <w:style w:type="paragraph" w:styleId="Heading2">
+  <w:style w:type="paragraph" w:styleId="Titolo2">
     <w:name w:val="heading 2"/>
-    <w:basedOn w:val="Normal"/>
-    <w:next w:val="Normal"/>
+    <w:basedOn w:val="Normale"/>
+    <w:next w:val="Normale"/>
     <w:uiPriority w:val="9"/>
     <w:semiHidden/>
     <w:unhideWhenUsed/>
@@ -3567,10 +3720,10 @@
       <w:szCs w:val="32"/>
     </w:rPr>
   </w:style>
-  <w:style w:type="paragraph" w:styleId="Heading3">
+  <w:style w:type="paragraph" w:styleId="Titolo3">
     <w:name w:val="heading 3"/>
-    <w:basedOn w:val="Normal"/>
-    <w:next w:val="Normal"/>
+    <w:basedOn w:val="Normale"/>
+    <w:next w:val="Normale"/>
     <w:uiPriority w:val="9"/>
     <w:semiHidden/>
     <w:unhideWhenUsed/>
@@ -3589,10 +3742,10 @@
       <w:szCs w:val="28"/>
     </w:rPr>
   </w:style>
-  <w:style w:type="paragraph" w:styleId="Heading4">
+  <w:style w:type="paragraph" w:styleId="Titolo4">
     <w:name w:val="heading 4"/>
-    <w:basedOn w:val="Normal"/>
-    <w:next w:val="Normal"/>
+    <w:basedOn w:val="Normale"/>
+    <w:next w:val="Normale"/>
     <w:uiPriority w:val="9"/>
     <w:semiHidden/>
     <w:unhideWhenUsed/>
@@ -3611,10 +3764,10 @@
       <w:color w:val="0F4761" w:themeColor="accent1" w:themeShade="BF"/>
     </w:rPr>
   </w:style>
-  <w:style w:type="paragraph" w:styleId="Heading5">
+  <w:style w:type="paragraph" w:styleId="Titolo5">
     <w:name w:val="heading 5"/>
-    <w:basedOn w:val="Normal"/>
-    <w:next w:val="Normal"/>
+    <w:basedOn w:val="Normale"/>
+    <w:next w:val="Normale"/>
     <w:uiPriority w:val="9"/>
     <w:semiHidden/>
     <w:unhideWhenUsed/>
@@ -3631,10 +3784,10 @@
       <w:color w:val="0F4761" w:themeColor="accent1" w:themeShade="BF"/>
     </w:rPr>
   </w:style>
-  <w:style w:type="paragraph" w:styleId="Heading6">
+  <w:style w:type="paragraph" w:styleId="Titolo6">
     <w:name w:val="heading 6"/>
-    <w:basedOn w:val="Normal"/>
-    <w:next w:val="Normal"/>
+    <w:basedOn w:val="Normale"/>
+    <w:next w:val="Normale"/>
     <w:uiPriority w:val="9"/>
     <w:semiHidden/>
     <w:unhideWhenUsed/>
@@ -3653,10 +3806,10 @@
       <w:color w:val="595959" w:themeColor="text1" w:themeTint="A6"/>
     </w:rPr>
   </w:style>
-  <w:style w:type="paragraph" w:styleId="Heading7">
+  <w:style w:type="paragraph" w:styleId="Titolo7">
     <w:name w:val="heading 7"/>
-    <w:basedOn w:val="Normal"/>
-    <w:next w:val="Normal"/>
+    <w:basedOn w:val="Normale"/>
+    <w:next w:val="Normale"/>
     <w:uiPriority w:val="9"/>
     <w:semiHidden/>
     <w:unhideWhenUsed/>
@@ -3673,10 +3826,10 @@
       <w:color w:val="595959" w:themeColor="text1" w:themeTint="A6"/>
     </w:rPr>
   </w:style>
-  <w:style w:type="paragraph" w:styleId="Heading8">
+  <w:style w:type="paragraph" w:styleId="Titolo8">
     <w:name w:val="heading 8"/>
-    <w:basedOn w:val="Normal"/>
-    <w:next w:val="Normal"/>
+    <w:basedOn w:val="Normale"/>
+    <w:next w:val="Normale"/>
     <w:uiPriority w:val="9"/>
     <w:semiHidden/>
     <w:unhideWhenUsed/>
@@ -3694,10 +3847,10 @@
       <w:color w:val="272727" w:themeColor="text1" w:themeTint="D8"/>
     </w:rPr>
   </w:style>
-  <w:style w:type="paragraph" w:styleId="Heading9">
+  <w:style w:type="paragraph" w:styleId="Titolo9">
     <w:name w:val="heading 9"/>
-    <w:basedOn w:val="Normal"/>
-    <w:next w:val="Normal"/>
+    <w:basedOn w:val="Normale"/>
+    <w:next w:val="Normale"/>
     <w:uiPriority w:val="9"/>
     <w:semiHidden/>
     <w:unhideWhenUsed/>
@@ -3713,13 +3866,13 @@
       <w:color w:val="272727" w:themeColor="text1" w:themeTint="D8"/>
     </w:rPr>
   </w:style>
-  <w:style w:type="character" w:default="1" w:styleId="DefaultParagraphFont">
+  <w:style w:type="character" w:default="1" w:styleId="Carpredefinitoparagrafo">
     <w:name w:val="Default Paragraph Font"/>
     <w:uiPriority w:val="1"/>
     <w:semiHidden/>
     <w:unhideWhenUsed/>
   </w:style>
-  <w:style w:type="table" w:default="1" w:styleId="TableNormal">
+  <w:style w:type="table" w:default="1" w:styleId="Tabellanormale">
     <w:name w:val="Normal Table"/>
     <w:uiPriority w:val="99"/>
     <w:semiHidden/>
@@ -3734,15 +3887,15 @@
       </w:tblCellMar>
     </w:tblPr>
   </w:style>
-  <w:style w:type="numbering" w:default="1" w:styleId="NoList">
+  <w:style w:type="numbering" w:default="1" w:styleId="Nessunelenco">
     <w:name w:val="No List"/>
     <w:uiPriority w:val="99"/>
     <w:semiHidden/>
     <w:unhideWhenUsed/>
   </w:style>
-  <w:style w:type="paragraph" w:styleId="ListParagraph">
+  <w:style w:type="paragraph" w:styleId="Paragrafoelenco">
     <w:name w:val="List Paragraph"/>
-    <w:basedOn w:val="Normal"/>
+    <w:basedOn w:val="Normale"/>
     <w:uiPriority w:val="34"/>
     <w:qFormat/>
     <w:rsid w:val="00FF403B"/>
@@ -3751,9 +3904,9 @@
       <w:contextualSpacing/>
     </w:pPr>
   </w:style>
-  <w:style w:type="character" w:styleId="IntenseEmphasis">
+  <w:style w:type="character" w:styleId="Enfasiintensa">
     <w:name w:val="Intense Emphasis"/>
-    <w:basedOn w:val="DefaultParagraphFont"/>
+    <w:basedOn w:val="Carpredefinitoparagrafo"/>
     <w:uiPriority w:val="21"/>
     <w:qFormat/>
     <w:rsid w:val="00FF403B"/>
@@ -3763,9 +3916,9 @@
       <w:color w:val="0F4761" w:themeColor="accent1" w:themeShade="BF"/>
     </w:rPr>
   </w:style>
-  <w:style w:type="character" w:styleId="IntenseReference">
+  <w:style w:type="character" w:styleId="Riferimentointenso">
     <w:name w:val="Intense Reference"/>
-    <w:basedOn w:val="DefaultParagraphFont"/>
+    <w:basedOn w:val="Carpredefinitoparagrafo"/>
     <w:uiPriority w:val="32"/>
     <w:qFormat/>
     <w:rsid w:val="00FF403B"/>
@@ -3779,7 +3932,7 @@
   </w:style>
   <w:style w:type="character" w:customStyle="1" w:styleId="Titolo1Carattere">
     <w:name w:val="Titolo 1 Carattere"/>
-    <w:basedOn w:val="DefaultParagraphFont"/>
+    <w:basedOn w:val="Carpredefinitoparagrafo"/>
     <w:uiPriority w:val="9"/>
     <w:rsid w:val="00B33B38"/>
     <w:rPr>
@@ -3791,7 +3944,7 @@
   </w:style>
   <w:style w:type="character" w:customStyle="1" w:styleId="Titolo2Carattere">
     <w:name w:val="Titolo 2 Carattere"/>
-    <w:basedOn w:val="DefaultParagraphFont"/>
+    <w:basedOn w:val="Carpredefinitoparagrafo"/>
     <w:uiPriority w:val="9"/>
     <w:semiHidden/>
     <w:rsid w:val="00B33B38"/>
@@ -3804,7 +3957,7 @@
   </w:style>
   <w:style w:type="character" w:customStyle="1" w:styleId="Titolo3Carattere">
     <w:name w:val="Titolo 3 Carattere"/>
-    <w:basedOn w:val="DefaultParagraphFont"/>
+    <w:basedOn w:val="Carpredefinitoparagrafo"/>
     <w:uiPriority w:val="9"/>
     <w:semiHidden/>
     <w:rsid w:val="00B33B38"/>
@@ -3817,7 +3970,7 @@
   </w:style>
   <w:style w:type="character" w:customStyle="1" w:styleId="Titolo4Carattere">
     <w:name w:val="Titolo 4 Carattere"/>
-    <w:basedOn w:val="DefaultParagraphFont"/>
+    <w:basedOn w:val="Carpredefinitoparagrafo"/>
     <w:uiPriority w:val="9"/>
     <w:semiHidden/>
     <w:rsid w:val="00B33B38"/>
@@ -3830,7 +3983,7 @@
   </w:style>
   <w:style w:type="character" w:customStyle="1" w:styleId="Titolo5Carattere">
     <w:name w:val="Titolo 5 Carattere"/>
-    <w:basedOn w:val="DefaultParagraphFont"/>
+    <w:basedOn w:val="Carpredefinitoparagrafo"/>
     <w:uiPriority w:val="9"/>
     <w:semiHidden/>
     <w:rsid w:val="00B33B38"/>
@@ -3841,7 +3994,7 @@
   </w:style>
   <w:style w:type="character" w:customStyle="1" w:styleId="Titolo6Carattere">
     <w:name w:val="Titolo 6 Carattere"/>
-    <w:basedOn w:val="DefaultParagraphFont"/>
+    <w:basedOn w:val="Carpredefinitoparagrafo"/>
     <w:uiPriority w:val="9"/>
     <w:semiHidden/>
     <w:rsid w:val="00B33B38"/>
@@ -3854,7 +4007,7 @@
   </w:style>
   <w:style w:type="character" w:customStyle="1" w:styleId="Titolo7Carattere">
     <w:name w:val="Titolo 7 Carattere"/>
-    <w:basedOn w:val="DefaultParagraphFont"/>
+    <w:basedOn w:val="Carpredefinitoparagrafo"/>
     <w:uiPriority w:val="9"/>
     <w:semiHidden/>
     <w:rsid w:val="00B33B38"/>
@@ -3865,7 +4018,7 @@
   </w:style>
   <w:style w:type="character" w:customStyle="1" w:styleId="Titolo8Carattere">
     <w:name w:val="Titolo 8 Carattere"/>
-    <w:basedOn w:val="DefaultParagraphFont"/>
+    <w:basedOn w:val="Carpredefinitoparagrafo"/>
     <w:uiPriority w:val="9"/>
     <w:semiHidden/>
     <w:rsid w:val="00B33B38"/>
@@ -3878,7 +4031,7 @@
   </w:style>
   <w:style w:type="character" w:customStyle="1" w:styleId="Titolo9Carattere">
     <w:name w:val="Titolo 9 Carattere"/>
-    <w:basedOn w:val="DefaultParagraphFont"/>
+    <w:basedOn w:val="Carpredefinitoparagrafo"/>
     <w:uiPriority w:val="9"/>
     <w:semiHidden/>
     <w:rsid w:val="00B33B38"/>
@@ -3889,7 +4042,7 @@
   </w:style>
   <w:style w:type="character" w:customStyle="1" w:styleId="TitoloCarattere">
     <w:name w:val="Titolo Carattere"/>
-    <w:basedOn w:val="DefaultParagraphFont"/>
+    <w:basedOn w:val="Carpredefinitoparagrafo"/>
     <w:uiPriority w:val="10"/>
     <w:rsid w:val="00B33B38"/>
     <w:rPr>
@@ -3902,7 +4055,7 @@
   </w:style>
   <w:style w:type="character" w:customStyle="1" w:styleId="SottotitoloCarattere">
     <w:name w:val="Sottotitolo Carattere"/>
-    <w:basedOn w:val="DefaultParagraphFont"/>
+    <w:basedOn w:val="Carpredefinitoparagrafo"/>
     <w:uiPriority w:val="11"/>
     <w:rsid w:val="00B33B38"/>
     <w:rPr>
@@ -3915,7 +4068,7 @@
   </w:style>
   <w:style w:type="character" w:customStyle="1" w:styleId="CitazioneCarattere">
     <w:name w:val="Citazione Carattere"/>
-    <w:basedOn w:val="DefaultParagraphFont"/>
+    <w:basedOn w:val="Carpredefinitoparagrafo"/>
     <w:uiPriority w:val="29"/>
     <w:rsid w:val="00B33B38"/>
     <w:rPr>
@@ -3926,7 +4079,7 @@
   </w:style>
   <w:style w:type="character" w:customStyle="1" w:styleId="CitazioneintensaCarattere">
     <w:name w:val="Citazione intensa Carattere"/>
-    <w:basedOn w:val="DefaultParagraphFont"/>
+    <w:basedOn w:val="Carpredefinitoparagrafo"/>
     <w:uiPriority w:val="30"/>
     <w:rsid w:val="00B33B38"/>
     <w:rPr>
@@ -3935,8 +4088,8 @@
       <w:color w:val="0F4761" w:themeColor="accent1" w:themeShade="BF"/>
     </w:rPr>
   </w:style>
-  <w:style w:type="paragraph" w:customStyle="1" w:styleId="Revisione">
-    <w:name w:val="Revisione"/>
+  <w:style w:type="paragraph" w:customStyle="1" w:styleId="Revisione1">
+    <w:name w:val="Revisione1"/>
     <w:hidden/>
     <w:uiPriority w:val="99"/>
     <w:semiHidden/>
@@ -4252,26 +4405,6 @@
 </file>
 
 <file path=customXml/item1.xml><?xml version="1.0" encoding="utf-8"?>
-<?mso-contentType ?>
-<FormTemplates xmlns="http://schemas.microsoft.com/sharepoint/v3/contenttype/forms">
-  <Display>DocumentLibraryForm</Display>
-  <Edit>DocumentLibraryForm</Edit>
-  <New>DocumentLibraryForm</New>
-</FormTemplates>
-</file>
-
-<file path=customXml/item2.xml><?xml version="1.0" encoding="utf-8"?>
-<p:properties xmlns:p="http://schemas.microsoft.com/office/2006/metadata/properties" xmlns:xsi="http://www.w3.org/2001/XMLSchema-instance" xmlns:pc="http://schemas.microsoft.com/office/infopath/2007/PartnerControls">
-  <documentManagement>
-    <lcf76f155ced4ddcb4097134ff3c332f xmlns="ab92c565-5003-4ac3-93a3-a3ce8796a3c0">
-      <Terms xmlns="http://schemas.microsoft.com/office/infopath/2007/PartnerControls"/>
-    </lcf76f155ced4ddcb4097134ff3c332f>
-    <TaxCatchAll xmlns="aa1b21cb-23df-461b-8b8e-4aaeac2f3f50" xsi:nil="true"/>
-  </documentManagement>
-</p:properties>
-</file>
-
-<file path=customXml/item3.xml><?xml version="1.0" encoding="utf-8"?>
 <ct:contentTypeSchema xmlns:ct="http://schemas.microsoft.com/office/2006/metadata/contentType" xmlns:ma="http://schemas.microsoft.com/office/2006/metadata/properties/metaAttributes" ct:_="" ma:_="" ma:contentTypeName="Document" ma:contentTypeID="0x010100B6889C2593FACB4192549183B8B19287" ma:contentTypeVersion="11" ma:contentTypeDescription="Create a new document." ma:contentTypeScope="" ma:versionID="32060b2073082e2092342fdaa07ba96e">
   <xsd:schema xmlns:xsd="http://www.w3.org/2001/XMLSchema" xmlns:xs="http://www.w3.org/2001/XMLSchema" xmlns:p="http://schemas.microsoft.com/office/2006/metadata/properties" xmlns:ns2="ab92c565-5003-4ac3-93a3-a3ce8796a3c0" xmlns:ns3="aa1b21cb-23df-461b-8b8e-4aaeac2f3f50" targetNamespace="http://schemas.microsoft.com/office/2006/metadata/properties" ma:root="true" ma:fieldsID="930e06c061e109ec993a06acfd2977e1" ns2:_="" ns3:_="">
     <xsd:import namespace="ab92c565-5003-4ac3-93a3-a3ce8796a3c0"/>
@@ -4466,10 +4599,41 @@
 </ct:contentTypeSchema>
 </file>
 
+<file path=customXml/item2.xml><?xml version="1.0" encoding="utf-8"?>
+<p:properties xmlns:p="http://schemas.microsoft.com/office/2006/metadata/properties" xmlns:xsi="http://www.w3.org/2001/XMLSchema-instance" xmlns:pc="http://schemas.microsoft.com/office/infopath/2007/PartnerControls">
+  <documentManagement>
+    <lcf76f155ced4ddcb4097134ff3c332f xmlns="ab92c565-5003-4ac3-93a3-a3ce8796a3c0">
+      <Terms xmlns="http://schemas.microsoft.com/office/infopath/2007/PartnerControls"/>
+    </lcf76f155ced4ddcb4097134ff3c332f>
+    <TaxCatchAll xmlns="aa1b21cb-23df-461b-8b8e-4aaeac2f3f50" xsi:nil="true"/>
+  </documentManagement>
+</p:properties>
+</file>
+
+<file path=customXml/item3.xml><?xml version="1.0" encoding="utf-8"?>
+<?mso-contentType ?>
+<FormTemplates xmlns="http://schemas.microsoft.com/sharepoint/v3/contenttype/forms">
+  <Display>DocumentLibraryForm</Display>
+  <Edit>DocumentLibraryForm</Edit>
+  <New>DocumentLibraryForm</New>
+</FormTemplates>
+</file>
+
 <file path=customXml/itemProps1.xml><?xml version="1.0" encoding="utf-8"?>
-<ds:datastoreItem xmlns:ds="http://schemas.openxmlformats.org/officeDocument/2006/customXml" ds:itemID="{0B54F26F-8F75-446C-A248-930761B4E27B}">
+<ds:datastoreItem xmlns:ds="http://schemas.openxmlformats.org/officeDocument/2006/customXml" ds:itemID="{C3F938F0-3AC9-4EB3-98CB-F4DEC8E42A8E}">
   <ds:schemaRefs>
-    <ds:schemaRef ds:uri="http://schemas.microsoft.com/sharepoint/v3/contenttype/forms"/>
+    <ds:schemaRef ds:uri="http://schemas.microsoft.com/office/2006/metadata/contentType"/>
+    <ds:schemaRef ds:uri="http://schemas.microsoft.com/office/2006/metadata/properties/metaAttributes"/>
+    <ds:schemaRef ds:uri="http://www.w3.org/2001/XMLSchema"/>
+    <ds:schemaRef ds:uri="http://schemas.microsoft.com/office/2006/metadata/properties"/>
+    <ds:schemaRef ds:uri="ab92c565-5003-4ac3-93a3-a3ce8796a3c0"/>
+    <ds:schemaRef ds:uri="aa1b21cb-23df-461b-8b8e-4aaeac2f3f50"/>
+    <ds:schemaRef ds:uri="http://schemas.microsoft.com/office/2006/documentManagement/types"/>
+    <ds:schemaRef ds:uri="http://schemas.microsoft.com/office/infopath/2007/PartnerControls"/>
+    <ds:schemaRef ds:uri="http://schemas.openxmlformats.org/package/2006/metadata/core-properties"/>
+    <ds:schemaRef ds:uri="http://purl.org/dc/elements/1.1/"/>
+    <ds:schemaRef ds:uri="http://purl.org/dc/terms/"/>
+    <ds:schemaRef ds:uri="http://schemas.microsoft.com/internal/obd"/>
   </ds:schemaRefs>
 </ds:datastoreItem>
 </file>
@@ -4486,20 +4650,9 @@
 </file>
 
 <file path=customXml/itemProps3.xml><?xml version="1.0" encoding="utf-8"?>
-<ds:datastoreItem xmlns:ds="http://schemas.openxmlformats.org/officeDocument/2006/customXml" ds:itemID="{C3F938F0-3AC9-4EB3-98CB-F4DEC8E42A8E}">
+<ds:datastoreItem xmlns:ds="http://schemas.openxmlformats.org/officeDocument/2006/customXml" ds:itemID="{0B54F26F-8F75-446C-A248-930761B4E27B}">
   <ds:schemaRefs>
-    <ds:schemaRef ds:uri="http://schemas.microsoft.com/office/2006/metadata/contentType"/>
-    <ds:schemaRef ds:uri="http://schemas.microsoft.com/office/2006/metadata/properties/metaAttributes"/>
-    <ds:schemaRef ds:uri="http://www.w3.org/2001/XMLSchema"/>
-    <ds:schemaRef ds:uri="http://schemas.microsoft.com/office/2006/metadata/properties"/>
-    <ds:schemaRef ds:uri="ab92c565-5003-4ac3-93a3-a3ce8796a3c0"/>
-    <ds:schemaRef ds:uri="aa1b21cb-23df-461b-8b8e-4aaeac2f3f50"/>
-    <ds:schemaRef ds:uri="http://schemas.microsoft.com/office/2006/documentManagement/types"/>
-    <ds:schemaRef ds:uri="http://schemas.microsoft.com/office/infopath/2007/PartnerControls"/>
-    <ds:schemaRef ds:uri="http://schemas.openxmlformats.org/package/2006/metadata/core-properties"/>
-    <ds:schemaRef ds:uri="http://purl.org/dc/elements/1.1/"/>
-    <ds:schemaRef ds:uri="http://purl.org/dc/terms/"/>
-    <ds:schemaRef ds:uri="http://schemas.microsoft.com/internal/obd"/>
+    <ds:schemaRef ds:uri="http://schemas.microsoft.com/sharepoint/v3/contenttype/forms"/>
   </ds:schemaRefs>
 </ds:datastoreItem>
 </file>
</xml_diff>

<commit_message>
Adding part of analyzed studies
</commit_message>
<xml_diff>
--- a/6_Quality_Appraisal/Quality_Appraisal_DARE_Questions.docx
+++ b/6_Quality_Appraisal/Quality_Appraisal_DARE_Questions.docx
@@ -130,50 +130,98 @@
     <w:p>
       <w:pPr>
         <w:rPr>
-          <w:b/>
-          <w:bCs/>
-          <w:lang w:val="en-US"/>
-        </w:rPr>
-      </w:pPr>
-      <w:r>
-        <w:rPr>
-          <w:b/>
-          <w:bCs/>
-          <w:lang w:val="en-US"/>
-        </w:rPr>
-        <w:t>Q2: Does the study focus on work about regression test case selection</w:t>
-      </w:r>
-      <w:r>
-        <w:rPr>
-          <w:b/>
-          <w:bCs/>
+          <w:b w:val="1"/>
+          <w:bCs w:val="1"/>
+          <w:lang w:val="en-US"/>
+        </w:rPr>
+      </w:pPr>
+      <w:r>
+        <w:rPr>
+          <w:b w:val="1"/>
+          <w:bCs w:val="1"/>
+          <w:lang w:val="en-US"/>
+        </w:rPr>
+        <w:t xml:space="preserve">Q2: Does the study focus </w:t>
+      </w:r>
+      <w:r>
+        <w:rPr>
+          <w:b w:val="1"/>
+          <w:bCs w:val="1"/>
+          <w:lang w:val="en-US"/>
+        </w:rPr>
+        <w:t>on work about</w:t>
+      </w:r>
+      <w:r>
+        <w:rPr>
+          <w:b w:val="1"/>
+          <w:bCs w:val="1"/>
+          <w:lang w:val="en-US"/>
+        </w:rPr>
+        <w:t xml:space="preserve"> regression test case selection</w:t>
+      </w:r>
+      <w:r>
+        <w:rPr>
+          <w:b w:val="1"/>
+          <w:bCs w:val="1"/>
           <w:lang w:val="en-US"/>
         </w:rPr>
         <w:t>,</w:t>
       </w:r>
       <w:r>
         <w:rPr>
-          <w:b/>
-          <w:bCs/>
+          <w:b w:val="1"/>
+          <w:bCs w:val="1"/>
           <w:lang w:val="en-US"/>
         </w:rPr>
         <w:t xml:space="preserve"> prioritization</w:t>
       </w:r>
       <w:r>
         <w:rPr>
-          <w:b/>
-          <w:bCs/>
+          <w:b w:val="1"/>
+          <w:bCs w:val="1"/>
           <w:lang w:val="en-US"/>
         </w:rPr>
         <w:t>,</w:t>
       </w:r>
       <w:r>
         <w:rPr>
-          <w:b/>
-          <w:bCs/>
-          <w:lang w:val="en-US"/>
-        </w:rPr>
-        <w:t xml:space="preserve"> or minimization?</w:t>
+          <w:b w:val="1"/>
+          <w:bCs w:val="1"/>
+          <w:lang w:val="en-US"/>
+        </w:rPr>
+        <w:t xml:space="preserve"> or</w:t>
+      </w:r>
+      <w:r>
+        <w:rPr>
+          <w:b w:val="1"/>
+          <w:bCs w:val="1"/>
+          <w:lang w:val="en-US"/>
+        </w:rPr>
+        <w:t xml:space="preserve"> test suite</w:t>
+      </w:r>
+      <w:r>
+        <w:rPr>
+          <w:b w:val="1"/>
+          <w:bCs w:val="1"/>
+          <w:lang w:val="en-US"/>
+        </w:rPr>
+        <w:t xml:space="preserve"> minimization</w:t>
+      </w:r>
+      <w:r>
+        <w:rPr>
+          <w:b w:val="1"/>
+          <w:bCs w:val="1"/>
+          <w:lang w:val="en-US"/>
+        </w:rPr>
+        <w:t xml:space="preserve"> or reduction</w:t>
+      </w:r>
+      <w:r>
+        <w:rPr>
+          <w:b w:val="1"/>
+          <w:bCs w:val="1"/>
+          <w:lang w:val="en-US"/>
+        </w:rPr>
+        <w:t>?</w:t>
       </w:r>
     </w:p>
     <w:p>
@@ -287,50 +335,58 @@
     <w:p>
       <w:pPr>
         <w:rPr>
-          <w:b/>
-          <w:bCs/>
-          <w:lang w:val="en-US"/>
-        </w:rPr>
-      </w:pPr>
-      <w:r>
-        <w:rPr>
-          <w:b/>
-          <w:bCs/>
+          <w:b w:val="1"/>
+          <w:bCs w:val="1"/>
+          <w:lang w:val="en-US"/>
+        </w:rPr>
+      </w:pPr>
+      <w:r>
+        <w:rPr>
+          <w:b w:val="1"/>
+          <w:bCs w:val="1"/>
           <w:lang w:val="en-US"/>
         </w:rPr>
         <w:t>Q3: Does the study cover the evaluation of regression test case selection</w:t>
       </w:r>
       <w:r>
         <w:rPr>
-          <w:b/>
-          <w:bCs/>
+          <w:b w:val="1"/>
+          <w:bCs w:val="1"/>
           <w:lang w:val="en-US"/>
         </w:rPr>
         <w:t>,</w:t>
       </w:r>
       <w:r>
         <w:rPr>
-          <w:b/>
-          <w:bCs/>
-          <w:lang w:val="en-US"/>
-        </w:rPr>
-        <w:t xml:space="preserve"> minimization</w:t>
-      </w:r>
-      <w:r>
-        <w:rPr>
-          <w:b/>
-          <w:bCs/>
-          <w:lang w:val="en-US"/>
-        </w:rPr>
-        <w:t>,</w:t>
-      </w:r>
-      <w:r>
-        <w:rPr>
-          <w:b/>
-          <w:bCs/>
-          <w:lang w:val="en-US"/>
-        </w:rPr>
-        <w:t xml:space="preserve"> or prioritization techniques?</w:t>
+          <w:b w:val="1"/>
+          <w:bCs w:val="1"/>
+          <w:lang w:val="en-US"/>
+        </w:rPr>
+        <w:t xml:space="preserve"> </w:t>
+      </w:r>
+      <w:r>
+        <w:rPr>
+          <w:b w:val="1"/>
+          <w:bCs w:val="1"/>
+          <w:lang w:val="en-US"/>
+        </w:rPr>
+        <w:t>prioritization</w:t>
+      </w:r>
+      <w:r>
+        <w:rPr>
+          <w:b w:val="1"/>
+          <w:bCs w:val="1"/>
+          <w:lang w:val="en-US"/>
+        </w:rPr>
+        <w:t xml:space="preserve"> or test suite minimization or reduction</w:t>
+      </w:r>
+      <w:r>
+        <w:rPr>
+          <w:b w:val="1"/>
+          <w:bCs w:val="1"/>
+          <w:lang w:val="en-US"/>
+        </w:rPr>
+        <w:t xml:space="preserve"> techniques?</w:t>
       </w:r>
     </w:p>
     <w:p>
@@ -345,8 +401,8 @@
       </w:pPr>
       <w:r>
         <w:rPr>
-          <w:b/>
-          <w:bCs/>
+          <w:b w:val="1"/>
+          <w:bCs w:val="1"/>
           <w:lang w:val="en-US"/>
         </w:rPr>
         <w:t>1.0</w:t>
@@ -355,43 +411,13 @@
         <w:rPr>
           <w:lang w:val="en-US"/>
         </w:rPr>
-        <w:t>: Yes, the work includes a survey, evaluation</w:t>
-      </w:r>
-      <w:r>
-        <w:rPr>
-          <w:lang w:val="en-US"/>
-        </w:rPr>
-        <w:t>,</w:t>
-      </w:r>
-      <w:r>
-        <w:rPr>
-          <w:lang w:val="en-US"/>
-        </w:rPr>
-        <w:t xml:space="preserve"> and detailed description of </w:t>
-      </w:r>
-      <w:r>
-        <w:rPr>
-          <w:lang w:val="en-US"/>
-        </w:rPr>
-        <w:t xml:space="preserve">methods, </w:t>
-      </w:r>
-      <w:r>
-        <w:rPr>
-          <w:lang w:val="en-US"/>
-        </w:rPr>
-        <w:t xml:space="preserve">including </w:t>
-      </w:r>
-      <w:r>
-        <w:rPr>
-          <w:lang w:val="en-US"/>
-        </w:rPr>
-        <w:t xml:space="preserve">their </w:t>
-      </w:r>
-      <w:r>
-        <w:rPr>
-          <w:lang w:val="en-US"/>
-        </w:rPr>
-        <w:t>classifications.</w:t>
+        <w:t xml:space="preserve">: </w:t>
+      </w:r>
+      <w:r>
+        <w:rPr>
+          <w:lang w:val="en-US"/>
+        </w:rPr>
+        <w:t>Exhaustive classification of all methods taken in consideration in the work.</w:t>
       </w:r>
     </w:p>
     <w:p>
@@ -674,58 +700,98 @@
     <w:p>
       <w:pPr>
         <w:rPr>
-          <w:b/>
-          <w:bCs/>
-          <w:lang w:val="en-US"/>
-        </w:rPr>
-      </w:pPr>
-      <w:r>
-        <w:rPr>
-          <w:b/>
-          <w:bCs/>
-          <w:lang w:val="en-US"/>
-        </w:rPr>
-        <w:t>Q5: Did the author(s) assess and compare the quality/validity of tools or automated regression test case selection</w:t>
-      </w:r>
-      <w:r>
-        <w:rPr>
-          <w:b/>
-          <w:bCs/>
+          <w:b w:val="1"/>
+          <w:bCs w:val="1"/>
+          <w:lang w:val="en-US"/>
+        </w:rPr>
+      </w:pPr>
+      <w:r>
+        <w:rPr>
+          <w:b w:val="1"/>
+          <w:bCs w:val="1"/>
+          <w:lang w:val="en-US"/>
+        </w:rPr>
+        <w:t xml:space="preserve">Q5: Did the author(s) assess and compare the quality/validity of tools or automated regression test case </w:t>
+      </w:r>
+      <w:r>
+        <w:rPr>
+          <w:b w:val="1"/>
+          <w:bCs w:val="1"/>
+          <w:lang w:val="en-US"/>
+        </w:rPr>
+        <w:t>selection</w:t>
+      </w:r>
+      <w:r>
+        <w:rPr>
+          <w:b w:val="1"/>
+          <w:bCs w:val="1"/>
           <w:lang w:val="en-US"/>
         </w:rPr>
         <w:t>,</w:t>
       </w:r>
       <w:r>
         <w:rPr>
-          <w:b/>
-          <w:bCs/>
+          <w:b w:val="1"/>
+          <w:bCs w:val="1"/>
           <w:lang w:val="en-US"/>
         </w:rPr>
         <w:t xml:space="preserve"> </w:t>
       </w:r>
       <w:r>
         <w:rPr>
-          <w:b/>
-          <w:bCs/>
+          <w:b w:val="1"/>
+          <w:bCs w:val="1"/>
           <w:lang w:val="en-US"/>
         </w:rPr>
         <w:t>prioritization</w:t>
       </w:r>
       <w:r>
         <w:rPr>
-          <w:b/>
-          <w:bCs/>
+          <w:b w:val="1"/>
+          <w:bCs w:val="1"/>
           <w:lang w:val="en-US"/>
         </w:rPr>
         <w:t>,</w:t>
       </w:r>
       <w:r>
         <w:rPr>
-          <w:b/>
-          <w:bCs/>
-          <w:lang w:val="en-US"/>
-        </w:rPr>
-        <w:t xml:space="preserve"> or minimization approaches in detail?</w:t>
+          <w:b w:val="1"/>
+          <w:bCs w:val="1"/>
+          <w:lang w:val="en-US"/>
+        </w:rPr>
+        <w:t xml:space="preserve"> or </w:t>
+      </w:r>
+      <w:r>
+        <w:rPr>
+          <w:b w:val="1"/>
+          <w:bCs w:val="1"/>
+          <w:lang w:val="en-US"/>
+        </w:rPr>
+        <w:t xml:space="preserve">test suite </w:t>
+      </w:r>
+      <w:r>
+        <w:rPr>
+          <w:b w:val="1"/>
+          <w:bCs w:val="1"/>
+          <w:lang w:val="en-US"/>
+        </w:rPr>
+        <w:t>minimization</w:t>
+      </w:r>
+      <w:r>
+        <w:rPr>
+          <w:b w:val="1"/>
+          <w:bCs w:val="1"/>
+          <w:lang w:val="en-US"/>
+        </w:rPr>
+        <w:t xml:space="preserve"> or reduction</w:t>
+      </w:r>
+      <w:r>
+        <w:rPr>
+          <w:b w:val="1"/>
+          <w:bCs w:val="1"/>
+          <w:lang w:val="en-US"/>
+        </w:rPr>
+        <w:t xml:space="preserve"> approaches in detail?</w:t>
       </w:r>
     </w:p>
     <w:p>
@@ -740,8 +806,8 @@
       </w:pPr>
       <w:r>
         <w:rPr>
-          <w:b/>
-          <w:bCs/>
+          <w:b w:val="1"/>
+          <w:bCs w:val="1"/>
           <w:lang w:val="en-US"/>
         </w:rPr>
         <w:t>1.0</w:t>
@@ -750,7 +816,25 @@
         <w:rPr>
           <w:lang w:val="en-US"/>
         </w:rPr>
-        <w:t>: Yes, in detail and high quality, including practical experiments or comprehensive/in-depth coverage and classification.</w:t>
+        <w:t xml:space="preserve">: Yes, </w:t>
+      </w:r>
+      <w:r>
+        <w:rPr>
+          <w:lang w:val="en-US"/>
+        </w:rPr>
+        <w:t xml:space="preserve">the methods have been executed to assess their </w:t>
+      </w:r>
+      <w:r>
+        <w:rPr>
+          <w:lang w:val="en-US"/>
+        </w:rPr>
+        <w:t>actual functioning</w:t>
+      </w:r>
+      <w:r>
+        <w:rPr>
+          <w:lang w:val="en-US"/>
+        </w:rPr>
+        <w:t>.</w:t>
       </w:r>
     </w:p>
     <w:p>
@@ -941,15 +1025,26 @@
           <w:ilvl w:val="0"/>
           <w:numId w:val="5"/>
         </w:numPr>
-      </w:pPr>
-      <w:r>
-        <w:rPr>
-          <w:b/>
+        <w:rPr/>
+      </w:pPr>
+      <w:r>
+        <w:rPr>
+          <w:b w:val="1"/>
+          <w:bCs w:val="1"/>
         </w:rPr>
         <w:t>0.0</w:t>
       </w:r>
       <w:r>
-        <w:t>: 2012/2015</w:t>
+        <w:rPr/>
+        <w:t>: 201</w:t>
+      </w:r>
+      <w:r>
+        <w:rPr/>
+        <w:t>3</w:t>
+      </w:r>
+      <w:r>
+        <w:rPr/>
+        <w:t>/2015</w:t>
       </w:r>
     </w:p>
     <w:p/>
@@ -1198,50 +1293,122 @@
     <w:p>
       <w:pPr>
         <w:rPr>
-          <w:b/>
-          <w:bCs/>
-          <w:lang w:val="en-US"/>
-        </w:rPr>
-      </w:pPr>
-      <w:r>
-        <w:rPr>
-          <w:b/>
-          <w:bCs/>
-          <w:lang w:val="en-US"/>
-        </w:rPr>
-        <w:t>Q2: Is the PS related to a new approach for regression test case selection</w:t>
-      </w:r>
-      <w:r>
-        <w:rPr>
-          <w:b/>
-          <w:bCs/>
+          <w:b w:val="1"/>
+          <w:bCs w:val="1"/>
+          <w:lang w:val="en-US"/>
+        </w:rPr>
+      </w:pPr>
+      <w:r>
+        <w:rPr>
+          <w:b w:val="1"/>
+          <w:bCs w:val="1"/>
+          <w:lang w:val="en-US"/>
+        </w:rPr>
+        <w:t xml:space="preserve">Q2: Is the PS related to </w:t>
+      </w:r>
+      <w:r>
+        <w:rPr>
+          <w:b w:val="1"/>
+          <w:bCs w:val="1"/>
+          <w:lang w:val="en-US"/>
+        </w:rPr>
+        <w:t>a new approach</w:t>
+      </w:r>
+      <w:r>
+        <w:rPr>
+          <w:b w:val="1"/>
+          <w:bCs w:val="1"/>
+          <w:lang w:val="en-US"/>
+        </w:rPr>
+        <w:t xml:space="preserve"> for </w:t>
+      </w:r>
+      <w:r>
+        <w:rPr>
+          <w:b w:val="1"/>
+          <w:bCs w:val="1"/>
+          <w:lang w:val="en-US"/>
+        </w:rPr>
+        <w:t>regression</w:t>
+      </w:r>
+      <w:r>
+        <w:rPr>
+          <w:b w:val="1"/>
+          <w:bCs w:val="1"/>
+          <w:lang w:val="en-US"/>
+        </w:rPr>
+        <w:t xml:space="preserve"> test case </w:t>
+      </w:r>
+      <w:r>
+        <w:rPr>
+          <w:b w:val="1"/>
+          <w:bCs w:val="1"/>
+          <w:lang w:val="en-US"/>
+        </w:rPr>
+        <w:t>selection</w:t>
+      </w:r>
+      <w:r>
+        <w:rPr>
+          <w:b w:val="1"/>
+          <w:bCs w:val="1"/>
           <w:lang w:val="en-US"/>
         </w:rPr>
         <w:t>,</w:t>
       </w:r>
       <w:r>
         <w:rPr>
-          <w:b/>
-          <w:bCs/>
+          <w:b w:val="1"/>
+          <w:bCs w:val="1"/>
           <w:lang w:val="en-US"/>
         </w:rPr>
         <w:t xml:space="preserve"> prioritization</w:t>
       </w:r>
       <w:r>
         <w:rPr>
-          <w:b/>
-          <w:bCs/>
+          <w:b w:val="1"/>
+          <w:bCs w:val="1"/>
           <w:lang w:val="en-US"/>
         </w:rPr>
         <w:t>,</w:t>
       </w:r>
       <w:r>
         <w:rPr>
-          <w:b/>
-          <w:bCs/>
-          <w:lang w:val="en-US"/>
-        </w:rPr>
-        <w:t xml:space="preserve"> or minimization?</w:t>
+          <w:b w:val="1"/>
+          <w:bCs w:val="1"/>
+          <w:lang w:val="en-US"/>
+        </w:rPr>
+        <w:t xml:space="preserve"> or</w:t>
+      </w:r>
+      <w:r>
+        <w:rPr>
+          <w:b w:val="1"/>
+          <w:bCs w:val="1"/>
+          <w:lang w:val="en-US"/>
+        </w:rPr>
+        <w:t xml:space="preserve"> test suite</w:t>
+      </w:r>
+      <w:r>
+        <w:rPr>
+          <w:b w:val="1"/>
+          <w:bCs w:val="1"/>
+          <w:lang w:val="en-US"/>
+        </w:rPr>
+        <w:t xml:space="preserve"> minimization</w:t>
+      </w:r>
+      <w:r>
+        <w:rPr>
+          <w:b w:val="1"/>
+          <w:bCs w:val="1"/>
+          <w:lang w:val="en-US"/>
+        </w:rPr>
+        <w:t xml:space="preserve"> or reduction</w:t>
+      </w:r>
+      <w:r>
+        <w:rPr>
+          <w:b w:val="1"/>
+          <w:bCs w:val="1"/>
+          <w:lang w:val="en-US"/>
+        </w:rPr>
+        <w:t>?</w:t>
       </w:r>
     </w:p>
     <w:p>
@@ -1531,16 +1698,24 @@
       </w:pPr>
       <w:r>
         <w:rPr>
-          <w:b/>
-          <w:bCs/>
-          <w:lang w:val="en-US"/>
-        </w:rPr>
-        <w:t>0,</w:t>
-      </w:r>
-      <w:r>
-        <w:rPr>
-          <w:b/>
-          <w:bCs/>
+          <w:b w:val="1"/>
+          <w:bCs w:val="1"/>
+          <w:lang w:val="en-US"/>
+        </w:rPr>
+        <w:t>0</w:t>
+      </w:r>
+      <w:r>
+        <w:rPr>
+          <w:b w:val="1"/>
+          <w:bCs w:val="1"/>
+          <w:lang w:val="en-US"/>
+        </w:rPr>
+        <w:t>.</w:t>
+      </w:r>
+      <w:r>
+        <w:rPr>
+          <w:b w:val="1"/>
+          <w:bCs w:val="1"/>
           <w:lang w:val="en-US"/>
         </w:rPr>
         <w:t>3</w:t>
@@ -1670,29 +1845,29 @@
     <w:p>
       <w:pPr>
         <w:rPr>
-          <w:del w:id="0" w:author="Dario DI NUCCI" w:date="2025-07-04T11:11:00Z" w16du:dateUtc="2025-07-04T09:11:00Z"/>
-          <w:lang w:val="en-US"/>
-        </w:rPr>
-      </w:pPr>
-    </w:p>
-    <w:p>
-      <w:pPr>
-        <w:rPr>
-          <w:del w:id="1" w:author="Dario DI NUCCI" w:date="2025-07-04T11:11:00Z" w16du:dateUtc="2025-07-04T09:11:00Z"/>
-          <w:lang w:val="en-US"/>
-        </w:rPr>
-      </w:pPr>
-    </w:p>
-    <w:p>
-      <w:pPr>
-        <w:rPr>
-          <w:del w:id="2" w:author="Dario DI NUCCI" w:date="2025-07-04T11:11:00Z" w16du:dateUtc="2025-07-04T09:11:00Z"/>
+          <w:del w:author="Dario DI NUCCI" w:date="2025-07-04T11:11:00Z" w16du:dateUtc="2025-07-04T09:11:00Z" w:id="0"/>
+          <w:lang w:val="en-US"/>
+        </w:rPr>
+      </w:pPr>
+    </w:p>
+    <w:p>
+      <w:pPr>
+        <w:rPr>
+          <w:del w:author="Dario DI NUCCI" w:date="2025-07-04T11:11:00Z" w16du:dateUtc="2025-07-04T09:11:00Z" w:id="1"/>
+          <w:lang w:val="en-US"/>
+        </w:rPr>
+      </w:pPr>
+    </w:p>
+    <w:p>
+      <w:pPr>
+        <w:rPr>
+          <w:del w:author="Dario DI NUCCI" w:date="2025-07-04T11:11:00Z" w16du:dateUtc="2025-07-04T09:11:00Z" w:id="2"/>
           <w:b/>
           <w:bCs/>
           <w:lang w:val="en-US"/>
         </w:rPr>
       </w:pPr>
-      <w:del w:id="3" w:author="Dario DI NUCCI" w:date="2025-07-04T11:11:00Z" w16du:dateUtc="2025-07-04T09:11:00Z">
+      <w:del w:author="Dario DI NUCCI" w:date="2025-07-04T11:11:00Z" w16du:dateUtc="2025-07-04T09:11:00Z" w:id="3">
         <w:r>
           <w:rPr>
             <w:b/>
@@ -1710,11 +1885,11 @@
           <w:numId w:val="10"/>
         </w:numPr>
         <w:rPr>
-          <w:del w:id="4" w:author="Dario DI NUCCI" w:date="2025-07-04T11:11:00Z" w16du:dateUtc="2025-07-04T09:11:00Z"/>
-          <w:lang w:val="en-US"/>
-        </w:rPr>
-      </w:pPr>
-      <w:del w:id="5" w:author="Dario DI NUCCI" w:date="2025-07-04T11:11:00Z" w16du:dateUtc="2025-07-04T09:11:00Z">
+          <w:del w:author="Dario DI NUCCI" w:date="2025-07-04T11:11:00Z" w16du:dateUtc="2025-07-04T09:11:00Z" w:id="4"/>
+          <w:lang w:val="en-US"/>
+        </w:rPr>
+      </w:pPr>
+      <w:del w:author="Dario DI NUCCI" w:date="2025-07-04T11:11:00Z" w16du:dateUtc="2025-07-04T09:11:00Z" w:id="5">
         <w:r>
           <w:rPr>
             <w:b/>
@@ -1762,11 +1937,11 @@
           <w:numId w:val="10"/>
         </w:numPr>
         <w:rPr>
-          <w:del w:id="6" w:author="Dario DI NUCCI" w:date="2025-07-04T11:11:00Z" w16du:dateUtc="2025-07-04T09:11:00Z"/>
-          <w:lang w:val="en-US"/>
-        </w:rPr>
-      </w:pPr>
-      <w:del w:id="7" w:author="Dario DI NUCCI" w:date="2025-07-04T11:11:00Z" w16du:dateUtc="2025-07-04T09:11:00Z">
+          <w:del w:author="Dario DI NUCCI" w:date="2025-07-04T11:11:00Z" w16du:dateUtc="2025-07-04T09:11:00Z" w:id="6"/>
+          <w:lang w:val="en-US"/>
+        </w:rPr>
+      </w:pPr>
+      <w:del w:author="Dario DI NUCCI" w:date="2025-07-04T11:11:00Z" w16du:dateUtc="2025-07-04T09:11:00Z" w:id="7">
         <w:r>
           <w:rPr>
             <w:b/>
@@ -1844,11 +2019,11 @@
           <w:numId w:val="10"/>
         </w:numPr>
         <w:rPr>
-          <w:del w:id="8" w:author="Dario DI NUCCI" w:date="2025-07-04T11:11:00Z" w16du:dateUtc="2025-07-04T09:11:00Z"/>
-          <w:lang w:val="en-US"/>
-        </w:rPr>
-      </w:pPr>
-      <w:del w:id="9" w:author="Dario DI NUCCI" w:date="2025-07-04T11:11:00Z" w16du:dateUtc="2025-07-04T09:11:00Z">
+          <w:del w:author="Dario DI NUCCI" w:date="2025-07-04T11:11:00Z" w16du:dateUtc="2025-07-04T09:11:00Z" w:id="8"/>
+          <w:lang w:val="en-US"/>
+        </w:rPr>
+      </w:pPr>
+      <w:del w:author="Dario DI NUCCI" w:date="2025-07-04T11:11:00Z" w16du:dateUtc="2025-07-04T09:11:00Z" w:id="9">
         <w:r>
           <w:rPr>
             <w:b/>
@@ -1880,29 +2055,29 @@
     <w:p>
       <w:pPr>
         <w:rPr>
-          <w:del w:id="10" w:author="Dario DI NUCCI" w:date="2025-07-04T11:11:00Z" w16du:dateUtc="2025-07-04T09:11:00Z"/>
-          <w:lang w:val="en-US"/>
-        </w:rPr>
-      </w:pPr>
-    </w:p>
-    <w:p>
-      <w:pPr>
-        <w:rPr>
-          <w:del w:id="11" w:author="Dario DI NUCCI" w:date="2025-07-04T11:11:00Z" w16du:dateUtc="2025-07-04T09:11:00Z"/>
-          <w:lang w:val="en-US"/>
-        </w:rPr>
-      </w:pPr>
-    </w:p>
-    <w:p>
-      <w:pPr>
-        <w:rPr>
-          <w:del w:id="12" w:author="Dario DI NUCCI" w:date="2025-07-04T11:11:00Z" w16du:dateUtc="2025-07-04T09:11:00Z"/>
+          <w:del w:author="Dario DI NUCCI" w:date="2025-07-04T11:11:00Z" w16du:dateUtc="2025-07-04T09:11:00Z" w:id="10"/>
+          <w:lang w:val="en-US"/>
+        </w:rPr>
+      </w:pPr>
+    </w:p>
+    <w:p>
+      <w:pPr>
+        <w:rPr>
+          <w:del w:author="Dario DI NUCCI" w:date="2025-07-04T11:11:00Z" w16du:dateUtc="2025-07-04T09:11:00Z" w:id="11"/>
+          <w:lang w:val="en-US"/>
+        </w:rPr>
+      </w:pPr>
+    </w:p>
+    <w:p>
+      <w:pPr>
+        <w:rPr>
+          <w:del w:author="Dario DI NUCCI" w:date="2025-07-04T11:11:00Z" w16du:dateUtc="2025-07-04T09:11:00Z" w:id="12"/>
           <w:b/>
           <w:bCs/>
           <w:lang w:val="en-US"/>
         </w:rPr>
       </w:pPr>
-      <w:del w:id="13" w:author="Dario DI NUCCI" w:date="2025-07-04T11:11:00Z" w16du:dateUtc="2025-07-04T09:11:00Z">
+      <w:del w:author="Dario DI NUCCI" w:date="2025-07-04T11:11:00Z" w16du:dateUtc="2025-07-04T09:11:00Z" w:id="13">
         <w:r>
           <w:rPr>
             <w:b/>
@@ -1920,11 +2095,11 @@
           <w:numId w:val="4"/>
         </w:numPr>
         <w:rPr>
-          <w:del w:id="14" w:author="Dario DI NUCCI" w:date="2025-07-04T11:11:00Z" w16du:dateUtc="2025-07-04T09:11:00Z"/>
-          <w:lang w:val="en-US"/>
-        </w:rPr>
-      </w:pPr>
-      <w:del w:id="15" w:author="Dario DI NUCCI" w:date="2025-07-04T11:11:00Z" w16du:dateUtc="2025-07-04T09:11:00Z">
+          <w:del w:author="Dario DI NUCCI" w:date="2025-07-04T11:11:00Z" w16du:dateUtc="2025-07-04T09:11:00Z" w:id="14"/>
+          <w:lang w:val="en-US"/>
+        </w:rPr>
+      </w:pPr>
+      <w:del w:author="Dario DI NUCCI" w:date="2025-07-04T11:11:00Z" w16du:dateUtc="2025-07-04T09:11:00Z" w:id="15">
         <w:r>
           <w:rPr>
             <w:b/>
@@ -1948,11 +2123,11 @@
           <w:numId w:val="4"/>
         </w:numPr>
         <w:rPr>
-          <w:del w:id="16" w:author="Dario DI NUCCI" w:date="2025-07-04T11:11:00Z" w16du:dateUtc="2025-07-04T09:11:00Z"/>
-          <w:lang w:val="en-US"/>
-        </w:rPr>
-      </w:pPr>
-      <w:del w:id="17" w:author="Dario DI NUCCI" w:date="2025-07-04T11:11:00Z" w16du:dateUtc="2025-07-04T09:11:00Z">
+          <w:del w:author="Dario DI NUCCI" w:date="2025-07-04T11:11:00Z" w16du:dateUtc="2025-07-04T09:11:00Z" w:id="16"/>
+          <w:lang w:val="en-US"/>
+        </w:rPr>
+      </w:pPr>
+      <w:del w:author="Dario DI NUCCI" w:date="2025-07-04T11:11:00Z" w16du:dateUtc="2025-07-04T09:11:00Z" w:id="17">
         <w:r>
           <w:rPr>
             <w:b/>
@@ -2012,11 +2187,11 @@
           <w:numId w:val="4"/>
         </w:numPr>
         <w:rPr>
-          <w:del w:id="18" w:author="Dario DI NUCCI" w:date="2025-07-04T11:11:00Z" w16du:dateUtc="2025-07-04T09:11:00Z"/>
-          <w:lang w:val="en-US"/>
-        </w:rPr>
-      </w:pPr>
-      <w:del w:id="19" w:author="Dario DI NUCCI" w:date="2025-07-04T11:11:00Z" w16du:dateUtc="2025-07-04T09:11:00Z">
+          <w:del w:author="Dario DI NUCCI" w:date="2025-07-04T11:11:00Z" w16du:dateUtc="2025-07-04T09:11:00Z" w:id="18"/>
+          <w:lang w:val="en-US"/>
+        </w:rPr>
+      </w:pPr>
+      <w:del w:author="Dario DI NUCCI" w:date="2025-07-04T11:11:00Z" w16du:dateUtc="2025-07-04T09:11:00Z" w:id="19">
         <w:r>
           <w:rPr>
             <w:b/>
@@ -2091,7 +2266,7 @@
       </w:pPr>
     </w:p>
     <w:sectPr>
-      <w:pgSz w:w="11906" w:h="16838"/>
+      <w:pgSz w:w="11906" w:h="16838" w:orient="portrait"/>
       <w:pgMar w:top="1417" w:right="1134" w:bottom="1134" w:left="1134" w:header="708" w:footer="708" w:gutter="0"/>
       <w:cols w:space="708"/>
       <w:docGrid w:linePitch="360"/>
@@ -3270,7 +3445,7 @@
   <w:docDefaults>
     <w:rPrDefault>
       <w:rPr>
-        <w:rFonts w:asciiTheme="minorHAnsi" w:eastAsiaTheme="minorHAnsi" w:hAnsiTheme="minorHAnsi" w:cstheme="minorBidi"/>
+        <w:rFonts w:asciiTheme="minorHAnsi" w:hAnsiTheme="minorHAnsi" w:eastAsiaTheme="minorHAnsi" w:cstheme="minorBidi"/>
         <w:kern w:val="2"/>
         <w:sz w:val="24"/>
         <w:szCs w:val="24"/>
@@ -3287,14 +3462,14 @@
   <w:latentStyles w:defLockedState="0" w:defUIPriority="99" w:defSemiHidden="0" w:defUnhideWhenUsed="0" w:defQFormat="0" w:count="376">
     <w:lsdException w:name="Normal" w:uiPriority="0" w:qFormat="1"/>
     <w:lsdException w:name="heading 1" w:uiPriority="9" w:qFormat="1"/>
-    <w:lsdException w:name="heading 2" w:semiHidden="1" w:uiPriority="9" w:unhideWhenUsed="1" w:qFormat="1"/>
-    <w:lsdException w:name="heading 3" w:semiHidden="1" w:uiPriority="9" w:unhideWhenUsed="1" w:qFormat="1"/>
-    <w:lsdException w:name="heading 4" w:semiHidden="1" w:uiPriority="9" w:unhideWhenUsed="1" w:qFormat="1"/>
-    <w:lsdException w:name="heading 5" w:semiHidden="1" w:uiPriority="9" w:unhideWhenUsed="1" w:qFormat="1"/>
-    <w:lsdException w:name="heading 6" w:semiHidden="1" w:uiPriority="9" w:unhideWhenUsed="1" w:qFormat="1"/>
-    <w:lsdException w:name="heading 7" w:semiHidden="1" w:uiPriority="9" w:unhideWhenUsed="1" w:qFormat="1"/>
-    <w:lsdException w:name="heading 8" w:semiHidden="1" w:uiPriority="9" w:unhideWhenUsed="1" w:qFormat="1"/>
-    <w:lsdException w:name="heading 9" w:semiHidden="1" w:uiPriority="9" w:unhideWhenUsed="1" w:qFormat="1"/>
+    <w:lsdException w:name="heading 2" w:uiPriority="9" w:semiHidden="1" w:unhideWhenUsed="1" w:qFormat="1"/>
+    <w:lsdException w:name="heading 3" w:uiPriority="9" w:semiHidden="1" w:unhideWhenUsed="1" w:qFormat="1"/>
+    <w:lsdException w:name="heading 4" w:uiPriority="9" w:semiHidden="1" w:unhideWhenUsed="1" w:qFormat="1"/>
+    <w:lsdException w:name="heading 5" w:uiPriority="9" w:semiHidden="1" w:unhideWhenUsed="1" w:qFormat="1"/>
+    <w:lsdException w:name="heading 6" w:uiPriority="9" w:semiHidden="1" w:unhideWhenUsed="1" w:qFormat="1"/>
+    <w:lsdException w:name="heading 7" w:uiPriority="9" w:semiHidden="1" w:unhideWhenUsed="1" w:qFormat="1"/>
+    <w:lsdException w:name="heading 8" w:uiPriority="9" w:semiHidden="1" w:unhideWhenUsed="1" w:qFormat="1"/>
+    <w:lsdException w:name="heading 9" w:uiPriority="9" w:semiHidden="1" w:unhideWhenUsed="1" w:qFormat="1"/>
     <w:lsdException w:name="index 1" w:semiHidden="1" w:unhideWhenUsed="1"/>
     <w:lsdException w:name="index 2" w:semiHidden="1" w:unhideWhenUsed="1"/>
     <w:lsdException w:name="index 3" w:semiHidden="1" w:unhideWhenUsed="1"/>
@@ -3304,22 +3479,22 @@
     <w:lsdException w:name="index 7" w:semiHidden="1" w:unhideWhenUsed="1"/>
     <w:lsdException w:name="index 8" w:semiHidden="1" w:unhideWhenUsed="1"/>
     <w:lsdException w:name="index 9" w:semiHidden="1" w:unhideWhenUsed="1"/>
-    <w:lsdException w:name="toc 1" w:semiHidden="1" w:uiPriority="39" w:unhideWhenUsed="1"/>
-    <w:lsdException w:name="toc 2" w:semiHidden="1" w:uiPriority="39" w:unhideWhenUsed="1"/>
-    <w:lsdException w:name="toc 3" w:semiHidden="1" w:uiPriority="39" w:unhideWhenUsed="1"/>
-    <w:lsdException w:name="toc 4" w:semiHidden="1" w:uiPriority="39" w:unhideWhenUsed="1"/>
-    <w:lsdException w:name="toc 5" w:semiHidden="1" w:uiPriority="39" w:unhideWhenUsed="1"/>
-    <w:lsdException w:name="toc 6" w:semiHidden="1" w:uiPriority="39" w:unhideWhenUsed="1"/>
-    <w:lsdException w:name="toc 7" w:semiHidden="1" w:uiPriority="39" w:unhideWhenUsed="1"/>
-    <w:lsdException w:name="toc 8" w:semiHidden="1" w:uiPriority="39" w:unhideWhenUsed="1"/>
-    <w:lsdException w:name="toc 9" w:semiHidden="1" w:uiPriority="39" w:unhideWhenUsed="1"/>
+    <w:lsdException w:name="toc 1" w:uiPriority="39" w:semiHidden="1" w:unhideWhenUsed="1"/>
+    <w:lsdException w:name="toc 2" w:uiPriority="39" w:semiHidden="1" w:unhideWhenUsed="1"/>
+    <w:lsdException w:name="toc 3" w:uiPriority="39" w:semiHidden="1" w:unhideWhenUsed="1"/>
+    <w:lsdException w:name="toc 4" w:uiPriority="39" w:semiHidden="1" w:unhideWhenUsed="1"/>
+    <w:lsdException w:name="toc 5" w:uiPriority="39" w:semiHidden="1" w:unhideWhenUsed="1"/>
+    <w:lsdException w:name="toc 6" w:uiPriority="39" w:semiHidden="1" w:unhideWhenUsed="1"/>
+    <w:lsdException w:name="toc 7" w:uiPriority="39" w:semiHidden="1" w:unhideWhenUsed="1"/>
+    <w:lsdException w:name="toc 8" w:uiPriority="39" w:semiHidden="1" w:unhideWhenUsed="1"/>
+    <w:lsdException w:name="toc 9" w:uiPriority="39" w:semiHidden="1" w:unhideWhenUsed="1"/>
     <w:lsdException w:name="Normal Indent" w:semiHidden="1" w:unhideWhenUsed="1"/>
     <w:lsdException w:name="footnote text" w:semiHidden="1" w:unhideWhenUsed="1"/>
     <w:lsdException w:name="annotation text" w:semiHidden="1" w:unhideWhenUsed="1"/>
     <w:lsdException w:name="header" w:semiHidden="1" w:unhideWhenUsed="1"/>
     <w:lsdException w:name="footer" w:semiHidden="1" w:unhideWhenUsed="1"/>
     <w:lsdException w:name="index heading" w:semiHidden="1" w:unhideWhenUsed="1"/>
-    <w:lsdException w:name="caption" w:semiHidden="1" w:uiPriority="35" w:unhideWhenUsed="1" w:qFormat="1"/>
+    <w:lsdException w:name="caption" w:uiPriority="35" w:semiHidden="1" w:unhideWhenUsed="1" w:qFormat="1"/>
     <w:lsdException w:name="table of figures" w:semiHidden="1" w:unhideWhenUsed="1"/>
     <w:lsdException w:name="envelope address" w:semiHidden="1" w:unhideWhenUsed="1"/>
     <w:lsdException w:name="envelope return" w:semiHidden="1" w:unhideWhenUsed="1"/>
@@ -3350,7 +3525,7 @@
     <w:lsdException w:name="Title" w:uiPriority="10" w:qFormat="1"/>
     <w:lsdException w:name="Closing" w:semiHidden="1" w:unhideWhenUsed="1"/>
     <w:lsdException w:name="Signature" w:semiHidden="1" w:unhideWhenUsed="1"/>
-    <w:lsdException w:name="Default Paragraph Font" w:semiHidden="1" w:uiPriority="1" w:unhideWhenUsed="1"/>
+    <w:lsdException w:name="Default Paragraph Font" w:uiPriority="1" w:semiHidden="1" w:unhideWhenUsed="1"/>
     <w:lsdException w:name="Body Text" w:semiHidden="1" w:unhideWhenUsed="1"/>
     <w:lsdException w:name="Body Text Indent" w:semiHidden="1" w:unhideWhenUsed="1"/>
     <w:lsdException w:name="List Continue" w:semiHidden="1" w:unhideWhenUsed="1"/>
@@ -3550,8 +3725,8 @@
     <w:lsdException w:name="Subtle Reference" w:uiPriority="31" w:qFormat="1"/>
     <w:lsdException w:name="Intense Reference" w:uiPriority="32" w:qFormat="1"/>
     <w:lsdException w:name="Book Title" w:uiPriority="33" w:qFormat="1"/>
-    <w:lsdException w:name="Bibliography" w:semiHidden="1" w:uiPriority="37" w:unhideWhenUsed="1"/>
-    <w:lsdException w:name="TOC Heading" w:semiHidden="1" w:uiPriority="39" w:unhideWhenUsed="1" w:qFormat="1"/>
+    <w:lsdException w:name="Bibliography" w:uiPriority="37" w:semiHidden="1" w:unhideWhenUsed="1"/>
+    <w:lsdException w:name="TOC Heading" w:uiPriority="39" w:semiHidden="1" w:unhideWhenUsed="1" w:qFormat="1"/>
     <w:lsdException w:name="Plain Table 1" w:uiPriority="41"/>
     <w:lsdException w:name="Plain Table 2" w:uiPriority="42"/>
     <w:lsdException w:name="Plain Table 3" w:uiPriority="43"/>
@@ -3662,7 +3837,7 @@
     <w:lsdException w:name="Unresolved Mention" w:semiHidden="1" w:unhideWhenUsed="1"/>
     <w:lsdException w:name="Smart Link" w:semiHidden="1" w:unhideWhenUsed="1"/>
   </w:latentStyles>
-  <w:style w:type="paragraph" w:default="1" w:styleId="Normale">
+  <w:style w:type="paragraph" w:styleId="Normale" w:default="1">
     <w:name w:val="Normal"/>
     <w:qFormat/>
     <w:rsid w:val="00FF403B"/>
@@ -3670,7 +3845,7 @@
       <w:spacing w:after="0" w:line="276" w:lineRule="auto"/>
     </w:pPr>
     <w:rPr>
-      <w:rFonts w:ascii="Arial" w:eastAsia="Arial" w:hAnsi="Arial" w:cs="Arial"/>
+      <w:rFonts w:ascii="Arial" w:hAnsi="Arial" w:eastAsia="Arial" w:cs="Arial"/>
       <w:kern w:val="0"/>
       <w:sz w:val="22"/>
       <w:szCs w:val="22"/>
@@ -3692,7 +3867,7 @@
       <w:outlineLvl w:val="0"/>
     </w:pPr>
     <w:rPr>
-      <w:rFonts w:asciiTheme="majorHAnsi" w:eastAsiaTheme="majorEastAsia" w:hAnsiTheme="majorHAnsi" w:cstheme="majorBidi"/>
+      <w:rFonts w:asciiTheme="majorHAnsi" w:hAnsiTheme="majorHAnsi" w:eastAsiaTheme="majorEastAsia" w:cstheme="majorBidi"/>
       <w:color w:val="0F4761" w:themeColor="accent1" w:themeShade="BF"/>
       <w:sz w:val="40"/>
       <w:szCs w:val="40"/>
@@ -3714,7 +3889,7 @@
       <w:outlineLvl w:val="1"/>
     </w:pPr>
     <w:rPr>
-      <w:rFonts w:asciiTheme="majorHAnsi" w:eastAsiaTheme="majorEastAsia" w:hAnsiTheme="majorHAnsi" w:cstheme="majorBidi"/>
+      <w:rFonts w:asciiTheme="majorHAnsi" w:hAnsiTheme="majorHAnsi" w:eastAsiaTheme="majorEastAsia" w:cstheme="majorBidi"/>
       <w:color w:val="0F4761" w:themeColor="accent1" w:themeShade="BF"/>
       <w:sz w:val="32"/>
       <w:szCs w:val="32"/>
@@ -3866,13 +4041,13 @@
       <w:color w:val="272727" w:themeColor="text1" w:themeTint="D8"/>
     </w:rPr>
   </w:style>
-  <w:style w:type="character" w:default="1" w:styleId="Carpredefinitoparagrafo">
+  <w:style w:type="character" w:styleId="Carpredefinitoparagrafo" w:default="1">
     <w:name w:val="Default Paragraph Font"/>
     <w:uiPriority w:val="1"/>
     <w:semiHidden/>
     <w:unhideWhenUsed/>
   </w:style>
-  <w:style w:type="table" w:default="1" w:styleId="Tabellanormale">
+  <w:style w:type="table" w:styleId="Tabellanormale" w:default="1">
     <w:name w:val="Normal Table"/>
     <w:uiPriority w:val="99"/>
     <w:semiHidden/>
@@ -3887,7 +4062,7 @@
       </w:tblCellMar>
     </w:tblPr>
   </w:style>
-  <w:style w:type="numbering" w:default="1" w:styleId="Nessunelenco">
+  <w:style w:type="numbering" w:styleId="Nessunelenco" w:default="1">
     <w:name w:val="No List"/>
     <w:uiPriority w:val="99"/>
     <w:semiHidden/>
@@ -3930,32 +4105,32 @@
       <w:spacing w:val="5"/>
     </w:rPr>
   </w:style>
-  <w:style w:type="character" w:customStyle="1" w:styleId="Titolo1Carattere">
+  <w:style w:type="character" w:styleId="Titolo1Carattere" w:customStyle="1">
     <w:name w:val="Titolo 1 Carattere"/>
     <w:basedOn w:val="Carpredefinitoparagrafo"/>
     <w:uiPriority w:val="9"/>
     <w:rsid w:val="00B33B38"/>
     <w:rPr>
-      <w:rFonts w:asciiTheme="majorHAnsi" w:eastAsiaTheme="majorEastAsia" w:hAnsiTheme="majorHAnsi" w:cstheme="majorBidi"/>
+      <w:rFonts w:asciiTheme="majorHAnsi" w:hAnsiTheme="majorHAnsi" w:eastAsiaTheme="majorEastAsia" w:cstheme="majorBidi"/>
       <w:color w:val="0F4761" w:themeColor="accent1" w:themeShade="BF"/>
       <w:sz w:val="40"/>
       <w:szCs w:val="40"/>
     </w:rPr>
   </w:style>
-  <w:style w:type="character" w:customStyle="1" w:styleId="Titolo2Carattere">
+  <w:style w:type="character" w:styleId="Titolo2Carattere" w:customStyle="1">
     <w:name w:val="Titolo 2 Carattere"/>
     <w:basedOn w:val="Carpredefinitoparagrafo"/>
     <w:uiPriority w:val="9"/>
     <w:semiHidden/>
     <w:rsid w:val="00B33B38"/>
     <w:rPr>
-      <w:rFonts w:asciiTheme="majorHAnsi" w:eastAsiaTheme="majorEastAsia" w:hAnsiTheme="majorHAnsi" w:cstheme="majorBidi"/>
+      <w:rFonts w:asciiTheme="majorHAnsi" w:hAnsiTheme="majorHAnsi" w:eastAsiaTheme="majorEastAsia" w:cstheme="majorBidi"/>
       <w:color w:val="0F4761" w:themeColor="accent1" w:themeShade="BF"/>
       <w:sz w:val="32"/>
       <w:szCs w:val="32"/>
     </w:rPr>
   </w:style>
-  <w:style w:type="character" w:customStyle="1" w:styleId="Titolo3Carattere">
+  <w:style w:type="character" w:styleId="Titolo3Carattere" w:customStyle="1">
     <w:name w:val="Titolo 3 Carattere"/>
     <w:basedOn w:val="Carpredefinitoparagrafo"/>
     <w:uiPriority w:val="9"/>
@@ -3968,7 +4143,7 @@
       <w:szCs w:val="28"/>
     </w:rPr>
   </w:style>
-  <w:style w:type="character" w:customStyle="1" w:styleId="Titolo4Carattere">
+  <w:style w:type="character" w:styleId="Titolo4Carattere" w:customStyle="1">
     <w:name w:val="Titolo 4 Carattere"/>
     <w:basedOn w:val="Carpredefinitoparagrafo"/>
     <w:uiPriority w:val="9"/>
@@ -3981,7 +4156,7 @@
       <w:color w:val="0F4761" w:themeColor="accent1" w:themeShade="BF"/>
     </w:rPr>
   </w:style>
-  <w:style w:type="character" w:customStyle="1" w:styleId="Titolo5Carattere">
+  <w:style w:type="character" w:styleId="Titolo5Carattere" w:customStyle="1">
     <w:name w:val="Titolo 5 Carattere"/>
     <w:basedOn w:val="Carpredefinitoparagrafo"/>
     <w:uiPriority w:val="9"/>
@@ -3992,7 +4167,7 @@
       <w:color w:val="0F4761" w:themeColor="accent1" w:themeShade="BF"/>
     </w:rPr>
   </w:style>
-  <w:style w:type="character" w:customStyle="1" w:styleId="Titolo6Carattere">
+  <w:style w:type="character" w:styleId="Titolo6Carattere" w:customStyle="1">
     <w:name w:val="Titolo 6 Carattere"/>
     <w:basedOn w:val="Carpredefinitoparagrafo"/>
     <w:uiPriority w:val="9"/>
@@ -4005,7 +4180,7 @@
       <w:color w:val="595959" w:themeColor="text1" w:themeTint="A6"/>
     </w:rPr>
   </w:style>
-  <w:style w:type="character" w:customStyle="1" w:styleId="Titolo7Carattere">
+  <w:style w:type="character" w:styleId="Titolo7Carattere" w:customStyle="1">
     <w:name w:val="Titolo 7 Carattere"/>
     <w:basedOn w:val="Carpredefinitoparagrafo"/>
     <w:uiPriority w:val="9"/>
@@ -4016,7 +4191,7 @@
       <w:color w:val="595959" w:themeColor="text1" w:themeTint="A6"/>
     </w:rPr>
   </w:style>
-  <w:style w:type="character" w:customStyle="1" w:styleId="Titolo8Carattere">
+  <w:style w:type="character" w:styleId="Titolo8Carattere" w:customStyle="1">
     <w:name w:val="Titolo 8 Carattere"/>
     <w:basedOn w:val="Carpredefinitoparagrafo"/>
     <w:uiPriority w:val="9"/>
@@ -4029,7 +4204,7 @@
       <w:color w:val="272727" w:themeColor="text1" w:themeTint="D8"/>
     </w:rPr>
   </w:style>
-  <w:style w:type="character" w:customStyle="1" w:styleId="Titolo9Carattere">
+  <w:style w:type="character" w:styleId="Titolo9Carattere" w:customStyle="1">
     <w:name w:val="Titolo 9 Carattere"/>
     <w:basedOn w:val="Carpredefinitoparagrafo"/>
     <w:uiPriority w:val="9"/>
@@ -4040,20 +4215,20 @@
       <w:color w:val="272727" w:themeColor="text1" w:themeTint="D8"/>
     </w:rPr>
   </w:style>
-  <w:style w:type="character" w:customStyle="1" w:styleId="TitoloCarattere">
+  <w:style w:type="character" w:styleId="TitoloCarattere" w:customStyle="1">
     <w:name w:val="Titolo Carattere"/>
     <w:basedOn w:val="Carpredefinitoparagrafo"/>
     <w:uiPriority w:val="10"/>
     <w:rsid w:val="00B33B38"/>
     <w:rPr>
-      <w:rFonts w:asciiTheme="majorHAnsi" w:eastAsiaTheme="majorEastAsia" w:hAnsiTheme="majorHAnsi" w:cstheme="majorBidi"/>
+      <w:rFonts w:asciiTheme="majorHAnsi" w:hAnsiTheme="majorHAnsi" w:eastAsiaTheme="majorEastAsia" w:cstheme="majorBidi"/>
       <w:spacing w:val="-10"/>
       <w:kern w:val="28"/>
       <w:sz w:val="56"/>
       <w:szCs w:val="56"/>
     </w:rPr>
   </w:style>
-  <w:style w:type="character" w:customStyle="1" w:styleId="SottotitoloCarattere">
+  <w:style w:type="character" w:styleId="SottotitoloCarattere" w:customStyle="1">
     <w:name w:val="Sottotitolo Carattere"/>
     <w:basedOn w:val="Carpredefinitoparagrafo"/>
     <w:uiPriority w:val="11"/>
@@ -4066,7 +4241,7 @@
       <w:szCs w:val="28"/>
     </w:rPr>
   </w:style>
-  <w:style w:type="character" w:customStyle="1" w:styleId="CitazioneCarattere">
+  <w:style w:type="character" w:styleId="CitazioneCarattere" w:customStyle="1">
     <w:name w:val="Citazione Carattere"/>
     <w:basedOn w:val="Carpredefinitoparagrafo"/>
     <w:uiPriority w:val="29"/>
@@ -4077,7 +4252,7 @@
       <w:color w:val="404040" w:themeColor="text1" w:themeTint="BF"/>
     </w:rPr>
   </w:style>
-  <w:style w:type="character" w:customStyle="1" w:styleId="CitazioneintensaCarattere">
+  <w:style w:type="character" w:styleId="CitazioneintensaCarattere" w:customStyle="1">
     <w:name w:val="Citazione intensa Carattere"/>
     <w:basedOn w:val="Carpredefinitoparagrafo"/>
     <w:uiPriority w:val="30"/>
@@ -4088,7 +4263,7 @@
       <w:color w:val="0F4761" w:themeColor="accent1" w:themeShade="BF"/>
     </w:rPr>
   </w:style>
-  <w:style w:type="paragraph" w:customStyle="1" w:styleId="Revisione1">
+  <w:style w:type="paragraph" w:styleId="Revisione1" w:customStyle="1">
     <w:name w:val="Revisione1"/>
     <w:hidden/>
     <w:uiPriority w:val="99"/>
@@ -4098,7 +4273,7 @@
       <w:spacing w:after="0" w:line="240" w:lineRule="auto"/>
     </w:pPr>
     <w:rPr>
-      <w:rFonts w:ascii="Arial" w:eastAsia="Times New Roman" w:hAnsi="Arial" w:cs="Arial"/>
+      <w:rFonts w:ascii="Arial" w:hAnsi="Arial" w:eastAsia="Times New Roman" w:cs="Arial"/>
       <w:kern w:val="0"/>
       <w:sz w:val="22"/>
       <w:szCs w:val="22"/>
@@ -4110,7 +4285,7 @@
 </file>
 
 <file path=word/theme/theme1.xml><?xml version="1.0" encoding="utf-8"?>
-<a:theme xmlns:a="http://schemas.openxmlformats.org/drawingml/2006/main" name="Tema di Office">
+<a:theme xmlns:a="http://schemas.openxmlformats.org/drawingml/2006/main" xmlns:thm15="http://schemas.microsoft.com/office/thememl/2012/main" name="Tema di Office">
   <a:themeElements>
     <a:clrScheme name="Office">
       <a:dk1>
@@ -4405,8 +4580,8 @@
 </file>
 
 <file path=customXml/item1.xml><?xml version="1.0" encoding="utf-8"?>
-<ct:contentTypeSchema xmlns:ct="http://schemas.microsoft.com/office/2006/metadata/contentType" xmlns:ma="http://schemas.microsoft.com/office/2006/metadata/properties/metaAttributes" ct:_="" ma:_="" ma:contentTypeName="Document" ma:contentTypeID="0x010100B6889C2593FACB4192549183B8B19287" ma:contentTypeVersion="11" ma:contentTypeDescription="Create a new document." ma:contentTypeScope="" ma:versionID="32060b2073082e2092342fdaa07ba96e">
-  <xsd:schema xmlns:xsd="http://www.w3.org/2001/XMLSchema" xmlns:xs="http://www.w3.org/2001/XMLSchema" xmlns:p="http://schemas.microsoft.com/office/2006/metadata/properties" xmlns:ns2="ab92c565-5003-4ac3-93a3-a3ce8796a3c0" xmlns:ns3="aa1b21cb-23df-461b-8b8e-4aaeac2f3f50" targetNamespace="http://schemas.microsoft.com/office/2006/metadata/properties" ma:root="true" ma:fieldsID="930e06c061e109ec993a06acfd2977e1" ns2:_="" ns3:_="">
+<ct:contentTypeSchema xmlns:ct="http://schemas.microsoft.com/office/2006/metadata/contentType" xmlns:ma="http://schemas.microsoft.com/office/2006/metadata/properties/metaAttributes" ct:_="" ma:_="" ma:contentTypeName="Document" ma:contentTypeID="0x010100B6889C2593FACB4192549183B8B19287" ma:contentTypeVersion="11" ma:contentTypeDescription="Create a new document." ma:contentTypeScope="" ma:versionID="d0441ed93293d98676a3ed4ecc34a2e8">
+  <xsd:schema xmlns:xsd="http://www.w3.org/2001/XMLSchema" xmlns:xs="http://www.w3.org/2001/XMLSchema" xmlns:p="http://schemas.microsoft.com/office/2006/metadata/properties" xmlns:ns2="ab92c565-5003-4ac3-93a3-a3ce8796a3c0" xmlns:ns3="aa1b21cb-23df-461b-8b8e-4aaeac2f3f50" targetNamespace="http://schemas.microsoft.com/office/2006/metadata/properties" ma:root="true" ma:fieldsID="338d4716adf2f542ea7f86f5cbff3681" ns2:_="" ns3:_="">
     <xsd:import namespace="ab92c565-5003-4ac3-93a3-a3ce8796a3c0"/>
     <xsd:import namespace="aa1b21cb-23df-461b-8b8e-4aaeac2f3f50"/>
     <xsd:element name="properties">
@@ -4620,22 +4795,7 @@
 </file>
 
 <file path=customXml/itemProps1.xml><?xml version="1.0" encoding="utf-8"?>
-<ds:datastoreItem xmlns:ds="http://schemas.openxmlformats.org/officeDocument/2006/customXml" ds:itemID="{C3F938F0-3AC9-4EB3-98CB-F4DEC8E42A8E}">
-  <ds:schemaRefs>
-    <ds:schemaRef ds:uri="http://schemas.microsoft.com/office/2006/metadata/contentType"/>
-    <ds:schemaRef ds:uri="http://schemas.microsoft.com/office/2006/metadata/properties/metaAttributes"/>
-    <ds:schemaRef ds:uri="http://www.w3.org/2001/XMLSchema"/>
-    <ds:schemaRef ds:uri="http://schemas.microsoft.com/office/2006/metadata/properties"/>
-    <ds:schemaRef ds:uri="ab92c565-5003-4ac3-93a3-a3ce8796a3c0"/>
-    <ds:schemaRef ds:uri="aa1b21cb-23df-461b-8b8e-4aaeac2f3f50"/>
-    <ds:schemaRef ds:uri="http://schemas.microsoft.com/office/2006/documentManagement/types"/>
-    <ds:schemaRef ds:uri="http://schemas.microsoft.com/office/infopath/2007/PartnerControls"/>
-    <ds:schemaRef ds:uri="http://schemas.openxmlformats.org/package/2006/metadata/core-properties"/>
-    <ds:schemaRef ds:uri="http://purl.org/dc/elements/1.1/"/>
-    <ds:schemaRef ds:uri="http://purl.org/dc/terms/"/>
-    <ds:schemaRef ds:uri="http://schemas.microsoft.com/internal/obd"/>
-  </ds:schemaRefs>
-</ds:datastoreItem>
+<ds:datastoreItem xmlns:ds="http://schemas.openxmlformats.org/officeDocument/2006/customXml" ds:itemID="{F1B62177-B9B7-4347-B8B1-31834EC516D3}"/>
 </file>
 
 <file path=customXml/itemProps2.xml><?xml version="1.0" encoding="utf-8"?>

</xml_diff>